<commit_message>
Update class and attribute names to English
</commit_message>
<xml_diff>
--- a/N12 Nhóm 01.docx
+++ b/N12 Nhóm 01.docx
@@ -5811,7 +5811,7 @@
           <w:color w:val="1E293B"/>
           <w:sz w:val="23"/>
         </w:rPr>
-        <w:t>Biểu đồ bao quát toàn bộ 13 thực thể phân tích nòng cốt của hệ thống và các mối liên kết nghiệp vụ giữa chúng:</w:t>
+        <w:t>Biểu đồ bao quát toàn bộ các thực thể phân tích nòng cốt của hệ thống (được đồng bộ chuẩn hóa tên tiếng Anh theo mô hình thiết kế) và các mối liên kết nghiệp vụ giữa chúng:</w:t>
       </w:r>
     </w:p>
     <w:p>
@@ -5913,7 +5913,7 @@
                 <w:color w:val="FFFFFF"/>
                 <w:sz w:val="21"/>
               </w:rPr>
-              <w:t>Tên lớp thực thể</w:t>
+              <w:t>Tên lớp thực thể (Class)</w:t>
             </w:r>
           </w:p>
         </w:tc>
@@ -5965,7 +5965,7 @@
                 <w:color w:val="FFFFFF"/>
                 <w:sz w:val="21"/>
               </w:rPr>
-              <w:t>Các thuộc tính phân tích cốt lõi</w:t>
+              <w:t>Các thuộc tính phân tích (Attributes)</w:t>
             </w:r>
           </w:p>
         </w:tc>
@@ -5992,7 +5992,7 @@
                 <w:color w:val="1E293B"/>
                 <w:sz w:val="20"/>
               </w:rPr>
-              <w:t>NguoiDung</w:t>
+              <w:t>User</w:t>
             </w:r>
           </w:p>
         </w:tc>
@@ -6042,7 +6042,7 @@
                 <w:color w:val="1E293B"/>
                 <w:sz w:val="20"/>
               </w:rPr>
-              <w:t>maNguoiDung, hoTen, email, soDienThoai, matKhau, vaiTro</w:t>
+              <w:t>userId, username, password, fullName, email, phoneNumber, role</w:t>
             </w:r>
           </w:p>
         </w:tc>
@@ -6069,7 +6069,7 @@
                 <w:color w:val="1E293B"/>
                 <w:sz w:val="20"/>
               </w:rPr>
-              <w:t>KhachHang</w:t>
+              <w:t>Customer</w:t>
             </w:r>
           </w:p>
         </w:tc>
@@ -6094,7 +6094,7 @@
                 <w:color w:val="1E293B"/>
                 <w:sz w:val="20"/>
               </w:rPr>
-              <w:t>Kế thừa NguoiDung, đại diện người mua vé</w:t>
+              <w:t>Kế thừa User, đại diện người mua vé</w:t>
             </w:r>
           </w:p>
         </w:tc>
@@ -6119,7 +6119,7 @@
                 <w:color w:val="1E293B"/>
                 <w:sz w:val="20"/>
               </w:rPr>
-              <w:t>diemTichLuy, hangThanhVien</w:t>
+              <w:t>rewardPoints, memberTier</w:t>
             </w:r>
           </w:p>
         </w:tc>
@@ -6146,7 +6146,7 @@
                 <w:color w:val="1E293B"/>
                 <w:sz w:val="20"/>
               </w:rPr>
-              <w:t>BanToChuc</w:t>
+              <w:t>Organizer</w:t>
             </w:r>
           </w:p>
         </w:tc>
@@ -6171,7 +6171,7 @@
                 <w:color w:val="1E293B"/>
                 <w:sz w:val="20"/>
               </w:rPr>
-              <w:t>Kế thừa NguoiDung, đơn vị tổ chức sự kiện</w:t>
+              <w:t>Kế thừa User, đơn vị tổ chức sự kiện</w:t>
             </w:r>
           </w:p>
         </w:tc>
@@ -6196,7 +6196,7 @@
                 <w:color w:val="1E293B"/>
                 <w:sz w:val="20"/>
               </w:rPr>
-              <w:t>tenToChuc, maSoThue, giayPhep, thongTinMoTa</w:t>
+              <w:t>companyName, taxId, businessLicense, contactInfo</w:t>
             </w:r>
           </w:p>
         </w:tc>
@@ -6223,7 +6223,7 @@
                 <w:color w:val="1E293B"/>
                 <w:sz w:val="20"/>
               </w:rPr>
-              <w:t>DiaDiem</w:t>
+              <w:t>Venue</w:t>
             </w:r>
           </w:p>
         </w:tc>
@@ -6273,7 +6273,7 @@
                 <w:color w:val="1E293B"/>
                 <w:sz w:val="20"/>
               </w:rPr>
-              <w:t>maDiaDiem, tenDiaDiem, diaChiChiTiet, sucChuaToiDa</w:t>
+              <w:t>venueId, venueName, address, capacity</w:t>
             </w:r>
           </w:p>
         </w:tc>
@@ -6300,7 +6300,7 @@
                 <w:color w:val="1E293B"/>
                 <w:sz w:val="20"/>
               </w:rPr>
-              <w:t>SoDoGhe</w:t>
+              <w:t>SeatMap</w:t>
             </w:r>
           </w:p>
         </w:tc>
@@ -6350,7 +6350,7 @@
                 <w:color w:val="1E293B"/>
                 <w:sz w:val="20"/>
               </w:rPr>
-              <w:t>maSoDo, tenSoDo, kieuSanKhau, tongSoGhe</w:t>
+              <w:t>seatMapId, mapName, stageType, totalSeats</w:t>
             </w:r>
           </w:p>
         </w:tc>
@@ -6377,7 +6377,7 @@
                 <w:color w:val="1E293B"/>
                 <w:sz w:val="20"/>
               </w:rPr>
-              <w:t>KhuVucGhe</w:t>
+              <w:t>SeatZone</w:t>
             </w:r>
           </w:p>
         </w:tc>
@@ -6427,7 +6427,7 @@
                 <w:color w:val="1E293B"/>
                 <w:sz w:val="20"/>
               </w:rPr>
-              <w:t>maKhuVuc, tenKhuVuc, mauSac, loaiKhuVuc, soLuongGhe</w:t>
+              <w:t>zoneId, zoneName, colorHex, zoneType, seatCount</w:t>
             </w:r>
           </w:p>
         </w:tc>
@@ -6454,7 +6454,7 @@
                 <w:color w:val="1E293B"/>
                 <w:sz w:val="20"/>
               </w:rPr>
-              <w:t>Ghe</w:t>
+              <w:t>Seat</w:t>
             </w:r>
           </w:p>
         </w:tc>
@@ -6504,7 +6504,7 @@
                 <w:color w:val="1E293B"/>
                 <w:sz w:val="20"/>
               </w:rPr>
-              <w:t>maGhe, hangGhe, soThuTu, toaDoX, toaDoY</w:t>
+              <w:t>seatId, rowLabel, seatNumber, coordinateX, coordinateY</w:t>
             </w:r>
           </w:p>
         </w:tc>
@@ -6531,7 +6531,7 @@
                 <w:color w:val="1E293B"/>
                 <w:sz w:val="20"/>
               </w:rPr>
-              <w:t>SuKien</w:t>
+              <w:t>Event</w:t>
             </w:r>
           </w:p>
         </w:tc>
@@ -6581,7 +6581,7 @@
                 <w:color w:val="1E293B"/>
                 <w:sz w:val="20"/>
               </w:rPr>
-              <w:t>maSuKien, tenSuKien, theLoai, moTa, hinhAnh, trangThai</w:t>
+              <w:t>eventId, title, category, description, bannerUrl, status</w:t>
             </w:r>
           </w:p>
         </w:tc>
@@ -6608,7 +6608,7 @@
                 <w:color w:val="1E293B"/>
                 <w:sz w:val="20"/>
               </w:rPr>
-              <w:t>SuatDien</w:t>
+              <w:t>Showtime</w:t>
             </w:r>
           </w:p>
         </w:tc>
@@ -6658,7 +6658,7 @@
                 <w:color w:val="1E293B"/>
                 <w:sz w:val="20"/>
               </w:rPr>
-              <w:t>maSuatDien, ngayDien, thoiGianBatDau, thoiGianKetThuc</w:t>
+              <w:t>showtimeId, showDate, startTime, endTime</w:t>
             </w:r>
           </w:p>
         </w:tc>
@@ -6685,7 +6685,7 @@
                 <w:color w:val="1E293B"/>
                 <w:sz w:val="20"/>
               </w:rPr>
-              <w:t>GiaVeKhuVuc</w:t>
+              <w:t>ZonePricing</w:t>
             </w:r>
           </w:p>
         </w:tc>
@@ -6735,7 +6735,7 @@
                 <w:color w:val="1E293B"/>
                 <w:sz w:val="20"/>
               </w:rPr>
-              <w:t>maGiaVe, donGia, soLuongToiDa</w:t>
+              <w:t>pricingId, price, maxQuota, soldCount</w:t>
             </w:r>
           </w:p>
         </w:tc>
@@ -6762,7 +6762,7 @@
                 <w:color w:val="1E293B"/>
                 <w:sz w:val="20"/>
               </w:rPr>
-              <w:t>HangDoiAo</w:t>
+              <w:t>VirtualQueue</w:t>
             </w:r>
           </w:p>
         </w:tc>
@@ -6812,7 +6812,7 @@
                 <w:color w:val="1E293B"/>
                 <w:sz w:val="20"/>
               </w:rPr>
-              <w:t>maHangDoi, soThuTu, thoiGianVao, trangThaiCho</w:t>
+              <w:t>queueId, queueNumber, accessToken, status</w:t>
             </w:r>
           </w:p>
         </w:tc>
@@ -6839,7 +6839,7 @@
                 <w:color w:val="1E293B"/>
                 <w:sz w:val="20"/>
               </w:rPr>
-              <w:t>GiuGheTamThoi</w:t>
+              <w:t>SeatHold</w:t>
             </w:r>
           </w:p>
         </w:tc>
@@ -6889,7 +6889,7 @@
                 <w:color w:val="1E293B"/>
                 <w:sz w:val="20"/>
               </w:rPr>
-              <w:t>maGiuGhe, thoiGianBatDau, thoiGianHetHan, trangThai</w:t>
+              <w:t>holdId, holdToken, startTime, expiresAt</w:t>
             </w:r>
           </w:p>
         </w:tc>
@@ -6916,7 +6916,7 @@
                 <w:color w:val="1E293B"/>
                 <w:sz w:val="20"/>
               </w:rPr>
-              <w:t>HoaDon</w:t>
+              <w:t>Order</w:t>
             </w:r>
           </w:p>
         </w:tc>
@@ -6966,7 +6966,238 @@
                 <w:color w:val="1E293B"/>
                 <w:sz w:val="20"/>
               </w:rPr>
-              <w:t>maHoaDon, ngayTao, tongTien, soTienGiam, trangThai</w:t>
+              <w:t>orderId, orderCode, subTotal, discount, finalTotal, status</w:t>
+            </w:r>
+          </w:p>
+        </w:tc>
+      </w:tr>
+      <w:tr>
+        <w:tc>
+          <w:tcPr>
+            <w:tcW w:type="dxa" w:w="2160"/>
+            <w:shd w:fill="F8FAFC"/>
+            <w:tcMar>
+              <w:top w:w="100" w:type="dxa"/>
+              <w:bottom w:w="100" w:type="dxa"/>
+              <w:left w:w="140" w:type="dxa"/>
+              <w:right w:w="140" w:type="dxa"/>
+            </w:tcMar>
+          </w:tcPr>
+          <w:p>
+            <w:pPr>
+              <w:jc w:val="center"/>
+            </w:pPr>
+            <w:r>
+              <w:rPr>
+                <w:rFonts w:ascii="Times New Roman" w:hAnsi="Times New Roman"/>
+                <w:color w:val="1E293B"/>
+                <w:sz w:val="20"/>
+              </w:rPr>
+              <w:t>Ticket</w:t>
+            </w:r>
+          </w:p>
+        </w:tc>
+        <w:tc>
+          <w:tcPr>
+            <w:tcW w:type="dxa" w:w="3312"/>
+            <w:shd w:fill="F8FAFC"/>
+            <w:tcMar>
+              <w:top w:w="100" w:type="dxa"/>
+              <w:bottom w:w="100" w:type="dxa"/>
+              <w:left w:w="140" w:type="dxa"/>
+              <w:right w:w="140" w:type="dxa"/>
+            </w:tcMar>
+          </w:tcPr>
+          <w:p>
+            <w:pPr>
+              <w:jc w:val="left"/>
+            </w:pPr>
+            <w:r>
+              <w:rPr>
+                <w:rFonts w:ascii="Times New Roman" w:hAnsi="Times New Roman"/>
+                <w:color w:val="1E293B"/>
+                <w:sz w:val="20"/>
+              </w:rPr>
+              <w:t>Vé điện tử cấp phát cho từng chỗ ngồi</w:t>
+            </w:r>
+          </w:p>
+        </w:tc>
+        <w:tc>
+          <w:tcPr>
+            <w:tcW w:type="dxa" w:w="3888"/>
+            <w:shd w:fill="F8FAFC"/>
+            <w:tcMar>
+              <w:top w:w="100" w:type="dxa"/>
+              <w:bottom w:w="100" w:type="dxa"/>
+              <w:left w:w="140" w:type="dxa"/>
+              <w:right w:w="140" w:type="dxa"/>
+            </w:tcMar>
+          </w:tcPr>
+          <w:p>
+            <w:pPr>
+              <w:jc w:val="left"/>
+            </w:pPr>
+            <w:r>
+              <w:rPr>
+                <w:rFonts w:ascii="Times New Roman" w:hAnsi="Times New Roman"/>
+                <w:color w:val="1E293B"/>
+                <w:sz w:val="20"/>
+              </w:rPr>
+              <w:t>ticketId, ticketCode, qrCodeHash, price, isUsed</w:t>
+            </w:r>
+          </w:p>
+        </w:tc>
+      </w:tr>
+      <w:tr>
+        <w:tc>
+          <w:tcPr>
+            <w:tcW w:type="dxa" w:w="2160"/>
+            <w:shd w:fill="FFFFFF"/>
+            <w:tcMar>
+              <w:top w:w="100" w:type="dxa"/>
+              <w:bottom w:w="100" w:type="dxa"/>
+              <w:left w:w="140" w:type="dxa"/>
+              <w:right w:w="140" w:type="dxa"/>
+            </w:tcMar>
+          </w:tcPr>
+          <w:p>
+            <w:pPr>
+              <w:jc w:val="center"/>
+            </w:pPr>
+            <w:r>
+              <w:rPr>
+                <w:rFonts w:ascii="Times New Roman" w:hAnsi="Times New Roman"/>
+                <w:color w:val="1E293B"/>
+                <w:sz w:val="20"/>
+              </w:rPr>
+              <w:t>Voucher</w:t>
+            </w:r>
+          </w:p>
+        </w:tc>
+        <w:tc>
+          <w:tcPr>
+            <w:tcW w:type="dxa" w:w="3312"/>
+            <w:shd w:fill="FFFFFF"/>
+            <w:tcMar>
+              <w:top w:w="100" w:type="dxa"/>
+              <w:bottom w:w="100" w:type="dxa"/>
+              <w:left w:w="140" w:type="dxa"/>
+              <w:right w:w="140" w:type="dxa"/>
+            </w:tcMar>
+          </w:tcPr>
+          <w:p>
+            <w:pPr>
+              <w:jc w:val="left"/>
+            </w:pPr>
+            <w:r>
+              <w:rPr>
+                <w:rFonts w:ascii="Times New Roman" w:hAnsi="Times New Roman"/>
+                <w:color w:val="1E293B"/>
+                <w:sz w:val="20"/>
+              </w:rPr>
+              <w:t>Mã giảm giá khuyến mãi áp dụng cho đơn hàng</w:t>
+            </w:r>
+          </w:p>
+        </w:tc>
+        <w:tc>
+          <w:tcPr>
+            <w:tcW w:type="dxa" w:w="3888"/>
+            <w:shd w:fill="FFFFFF"/>
+            <w:tcMar>
+              <w:top w:w="100" w:type="dxa"/>
+              <w:bottom w:w="100" w:type="dxa"/>
+              <w:left w:w="140" w:type="dxa"/>
+              <w:right w:w="140" w:type="dxa"/>
+            </w:tcMar>
+          </w:tcPr>
+          <w:p>
+            <w:pPr>
+              <w:jc w:val="left"/>
+            </w:pPr>
+            <w:r>
+              <w:rPr>
+                <w:rFonts w:ascii="Times New Roman" w:hAnsi="Times New Roman"/>
+                <w:color w:val="1E293B"/>
+                <w:sz w:val="20"/>
+              </w:rPr>
+              <w:t>voucherId, code, percentOff, maxDiscount, validUntil</w:t>
+            </w:r>
+          </w:p>
+        </w:tc>
+      </w:tr>
+      <w:tr>
+        <w:tc>
+          <w:tcPr>
+            <w:tcW w:type="dxa" w:w="2160"/>
+            <w:shd w:fill="F8FAFC"/>
+            <w:tcMar>
+              <w:top w:w="100" w:type="dxa"/>
+              <w:bottom w:w="100" w:type="dxa"/>
+              <w:left w:w="140" w:type="dxa"/>
+              <w:right w:w="140" w:type="dxa"/>
+            </w:tcMar>
+          </w:tcPr>
+          <w:p>
+            <w:pPr>
+              <w:jc w:val="center"/>
+            </w:pPr>
+            <w:r>
+              <w:rPr>
+                <w:rFonts w:ascii="Times New Roman" w:hAnsi="Times New Roman"/>
+                <w:color w:val="1E293B"/>
+                <w:sz w:val="20"/>
+              </w:rPr>
+              <w:t>PaymentTransaction</w:t>
+            </w:r>
+          </w:p>
+        </w:tc>
+        <w:tc>
+          <w:tcPr>
+            <w:tcW w:type="dxa" w:w="3312"/>
+            <w:shd w:fill="F8FAFC"/>
+            <w:tcMar>
+              <w:top w:w="100" w:type="dxa"/>
+              <w:bottom w:w="100" w:type="dxa"/>
+              <w:left w:w="140" w:type="dxa"/>
+              <w:right w:w="140" w:type="dxa"/>
+            </w:tcMar>
+          </w:tcPr>
+          <w:p>
+            <w:pPr>
+              <w:jc w:val="left"/>
+            </w:pPr>
+            <w:r>
+              <w:rPr>
+                <w:rFonts w:ascii="Times New Roman" w:hAnsi="Times New Roman"/>
+                <w:color w:val="1E293B"/>
+                <w:sz w:val="20"/>
+              </w:rPr>
+              <w:t>Giao dịch thanh toán trực tuyến qua cổng</w:t>
+            </w:r>
+          </w:p>
+        </w:tc>
+        <w:tc>
+          <w:tcPr>
+            <w:tcW w:type="dxa" w:w="3888"/>
+            <w:shd w:fill="F8FAFC"/>
+            <w:tcMar>
+              <w:top w:w="100" w:type="dxa"/>
+              <w:bottom w:w="100" w:type="dxa"/>
+              <w:left w:w="140" w:type="dxa"/>
+              <w:right w:w="140" w:type="dxa"/>
+            </w:tcMar>
+          </w:tcPr>
+          <w:p>
+            <w:pPr>
+              <w:jc w:val="left"/>
+            </w:pPr>
+            <w:r>
+              <w:rPr>
+                <w:rFonts w:ascii="Times New Roman" w:hAnsi="Times New Roman"/>
+                <w:color w:val="1E293B"/>
+                <w:sz w:val="20"/>
+              </w:rPr>
+              <w:t>transactionId, transRef, paymentMethod, transAmount, status</w:t>
             </w:r>
           </w:p>
         </w:tc>
@@ -7002,7 +7233,7 @@
           <w:color w:val="1E293B"/>
           <w:sz w:val="23"/>
         </w:rPr>
-        <w:t>Thể hiện quan hệ kế thừa giữa NguoiDung với KhachHang và BanToChuc, đồng thời liên kết với PhienDangNhap (phiên làm việc) và ThongBao (thông điệp gửi tới người dùng).</w:t>
+        <w:t>Thể hiện quan hệ kế thừa giữa User với Customer và Organizer, đồng thời liên kết với UserSession (phiên làm việc) và Notification (thông báo gửi tới người dùng).</w:t>
       </w:r>
     </w:p>
     <w:p>
@@ -7087,7 +7318,7 @@
           <w:color w:val="1E293B"/>
           <w:sz w:val="23"/>
         </w:rPr>
-        <w:t>Mô hình hóa thực thể SuKien liên kết với TheLoai, DiaDiem tổ chức, dàn NgheSi biểu diễn và danh sách SuKienYeuThich của khách hàng.</w:t>
+        <w:t>Mô hình hóa thực thể Event liên kết với Category, Venue tổ chức, dàn Artist biểu diễn và danh sách FavoriteEvent của khách hàng.</w:t>
       </w:r>
     </w:p>
     <w:p>
@@ -7172,7 +7403,7 @@
           <w:color w:val="1E293B"/>
           <w:sz w:val="23"/>
         </w:rPr>
-        <w:t>Mô hình hóa cấu trúc phân cấp không gian từ SoDoGhe -&gt; KhuVucGhe -&gt; Ghe, kết hợp với HangDoiAo và thực thể GiuGheTamThoi khóa giữ các ghế được chọn.</w:t>
+        <w:t>Mô hình hóa cấu trúc phân cấp không gian từ SeatMap -&gt; SeatZone -&gt; Seat, kết hợp với VirtualQueue và thực thể SeatHold khóa giữ các ghế được chọn.</w:t>
       </w:r>
     </w:p>
     <w:p>
@@ -7257,7 +7488,7 @@
           <w:color w:val="1E293B"/>
           <w:sz w:val="23"/>
         </w:rPr>
-        <w:t>HoaDon đóng vai trò trung tâm liên kết với MaGiamGia (0..1), GiaoDichThanhToan (1) và chứa tập hợp các Ve (1..*), mỗi Ve tương ứng một Ghe duy nhất.</w:t>
+        <w:t>Order đóng vai trò trung tâm liên kết với Voucher (0..1), PaymentTransaction (1) và chứa tập hợp các Ticket (1..*), mỗi Ticket tương ứng một Seat duy nhất.</w:t>
       </w:r>
     </w:p>
     <w:p>
@@ -7342,7 +7573,7 @@
           <w:color w:val="1E293B"/>
           <w:sz w:val="23"/>
         </w:rPr>
-        <w:t>BanToChuc quản lý nhiều SuKien, mỗi sự kiện áp dụng SoDoGhe và nhiều SuatDien, từ đó thiết lập GiaVeKhuVuc và kết xuất BaoCaoDoanhThu.</w:t>
+        <w:t>Organizer quản lý nhiều Event, mỗi sự kiện áp dụng SeatMap và nhiều Showtime, từ đó thiết lập ZonePricing và kết xuất RevenueReport.</w:t>
       </w:r>
     </w:p>
     <w:p>

</xml_diff>

<commit_message>
Design key revenue calculation use case for Module 5
</commit_message>
<xml_diff>
--- a/N12 Nhóm 01.docx
+++ b/N12 Nhóm 01.docx
@@ -10712,11 +10712,15 @@
                 <w:color w:val="1E293B"/>
                 <w:sz w:val="20"/>
               </w:rPr>
+              <w:t>+ calculateZoneGross(): double</w:t>
+              <w:br/>
+              <w:t>+ calculateRemainingSeats(): int</w:t>
+              <w:br/>
+              <w:t>+ getSoldRate(): double</w:t>
+              <w:br/>
               <w:t>+ isSoldOut(): boolean</w:t>
               <w:br/>
               <w:t>+ recordSale(quantity: int): void</w:t>
-              <w:br/>
-              <w:t>+ getRemainingQuota(): int</w:t>
             </w:r>
           </w:p>
         </w:tc>
@@ -10770,13 +10774,13 @@
               </w:rPr>
               <w:t>- id: Long [PK]</w:t>
               <w:br/>
-              <w:t>- totalTicketsSold: int</w:t>
+              <w:t>- eventId: Long</w:t>
               <w:br/>
-              <w:t>- grossRevenue: double</w:t>
+              <w:t>- calculatedAt: LocalDateTime</w:t>
               <w:br/>
-              <w:t>- occupancyRate: double [0.0 - 100.0%]</w:t>
+              <w:t>- taxRate: double</w:t>
               <w:br/>
-              <w:t>- generatedAt: LocalDateTime</w:t>
+              <w:t>- platformCommissionRate: double</w:t>
             </w:r>
           </w:p>
         </w:tc>
@@ -10801,11 +10805,1907 @@
                 <w:color w:val="1E293B"/>
                 <w:sz w:val="20"/>
               </w:rPr>
+              <w:t>+ calculateTotalCapacity(): int</w:t>
+              <w:br/>
+              <w:t>+ calculateTotalTicketsSold(): int</w:t>
+              <w:br/>
+              <w:t>+ calculateGrossRevenue(): double</w:t>
+              <w:br/>
+              <w:t>+ calculateNetRevenue(): double</w:t>
+              <w:br/>
+              <w:t>+ calculateOccupancyRate(): double</w:t>
+              <w:br/>
+              <w:t>+ calculateAverageTicketPrice(): double</w:t>
+              <w:br/>
+              <w:t>+ calculateZoneContribution(zoneId: Long): double</w:t>
+              <w:br/>
+              <w:t>+ evaluatePerformance(): PerformanceStatus</w:t>
+              <w:br/>
               <w:t>+ exportExcel(): byte[]</w:t>
               <w:br/>
               <w:t>+ exportPdf(): byte[]</w:t>
+            </w:r>
+          </w:p>
+        </w:tc>
+      </w:tr>
+    </w:tbl>
+    <w:p>
+      <w:pPr>
+        <w:spacing w:before="0" w:after="120"/>
+      </w:pPr>
+    </w:p>
+    <w:p>
+      <w:pPr>
+        <w:keepNext/>
+        <w:spacing w:before="240" w:after="80"/>
+      </w:pPr>
+      <w:r>
+        <w:rPr>
+          <w:rFonts w:ascii="Times New Roman" w:hAnsi="Times New Roman"/>
+          <w:b/>
+          <w:color w:val="1D4ED8"/>
+          <w:sz w:val="25"/>
+        </w:rPr>
+        <w:t>4.7. Thiết kế chi tiết chức năng trọng tâm Module 5: Xem thống kê doanh thu sự kiện</w:t>
+      </w:r>
+    </w:p>
+    <w:p>
+      <w:pPr>
+        <w:spacing w:before="0" w:after="100" w:line="300" w:lineRule="auto"/>
+      </w:pPr>
+      <w:r>
+        <w:rPr>
+          <w:rFonts w:ascii="Times New Roman" w:hAnsi="Times New Roman"/>
+          <w:b/>
+          <w:color w:val="0F172A"/>
+          <w:sz w:val="23"/>
+        </w:rPr>
+        <w:t xml:space="preserve">Lý do lựa chọn chức năng: </w:t>
+      </w:r>
+      <w:r>
+        <w:rPr>
+          <w:rFonts w:ascii="Times New Roman" w:hAnsi="Times New Roman"/>
+          <w:color w:val="1E293B"/>
+          <w:sz w:val="23"/>
+        </w:rPr>
+        <w:t>Trong Module 5, chức năng 'Xem thống kê doanh thu sự kiện' (View Event Revenue Statistics) là một chức năng nghiệp vụ đơn lẻ (Single Atomic Function - Read/Calculate Analytics) đóng vai trò quyết định hiệu quả kinh doanh của Ban tổ chức. Chức năng này không đơn thuần là truy vấn dữ liệu thô (DTO) mà đòi hỏi các lớp thực thể phải sở hữu các phương thức thực hiện tính toán tài chính phức tạp, đảm bảo tính đóng gói (Encapsulation) chuẩn mực của lập trình hướng đối tượng.</w:t>
+      </w:r>
+    </w:p>
+    <w:p>
+      <w:pPr>
+        <w:keepNext/>
+        <w:spacing w:before="160" w:after="60"/>
+      </w:pPr>
+      <w:r>
+        <w:rPr>
+          <w:rFonts w:ascii="Times New Roman" w:hAnsi="Times New Roman"/>
+          <w:b/>
+          <w:i/>
+          <w:color w:val="334155"/>
+          <w:sz w:val="23"/>
+        </w:rPr>
+        <w:t>a. Đặc tả ca sử dụng chi tiết (Use Case Specification)</w:t>
+      </w:r>
+    </w:p>
+    <w:tbl>
+      <w:tblPr>
+        <w:tblW w:type="auto" w:w="0"/>
+        <w:jc w:val="center"/>
+        <w:tblLook w:firstColumn="1" w:firstRow="1" w:lastColumn="0" w:lastRow="0" w:noHBand="0" w:noVBand="1" w:val="04A0"/>
+        <w:tblBorders>
+          <w:top w:val="single" w:sz="6" w:space="0" w:color="CBD5E1"/>
+          <w:left w:val="none"/>
+          <w:bottom w:val="single" w:sz="8" w:space="0" w:color="1E3A8A"/>
+          <w:right w:val="none"/>
+          <w:insideH w:val="single" w:sz="4" w:space="0" w:color="CBD5E1"/>
+          <w:insideV w:val="none"/>
+        </w:tblBorders>
+      </w:tblPr>
+      <w:tblGrid>
+        <w:gridCol w:w="4701"/>
+        <w:gridCol w:w="4701"/>
+      </w:tblGrid>
+      <w:tr>
+        <w:tc>
+          <w:tcPr>
+            <w:tcW w:type="dxa" w:w="3168"/>
+            <w:shd w:fill="1E3A8A"/>
+            <w:tcMar>
+              <w:top w:w="140" w:type="dxa"/>
+              <w:bottom w:w="140" w:type="dxa"/>
+              <w:left w:w="160" w:type="dxa"/>
+              <w:right w:w="160" w:type="dxa"/>
+            </w:tcMar>
+          </w:tcPr>
+          <w:p>
+            <w:pPr>
+              <w:jc w:val="center"/>
+            </w:pPr>
+            <w:r>
+              <w:rPr>
+                <w:rFonts w:ascii="Times New Roman" w:hAnsi="Times New Roman"/>
+                <w:b/>
+                <w:color w:val="FFFFFF"/>
+                <w:sz w:val="21"/>
+              </w:rPr>
+              <w:t>Thuộc tính đặc tả</w:t>
+            </w:r>
+          </w:p>
+        </w:tc>
+        <w:tc>
+          <w:tcPr>
+            <w:tcW w:type="dxa" w:w="6192"/>
+            <w:shd w:fill="1E3A8A"/>
+            <w:tcMar>
+              <w:top w:w="140" w:type="dxa"/>
+              <w:bottom w:w="140" w:type="dxa"/>
+              <w:left w:w="160" w:type="dxa"/>
+              <w:right w:w="160" w:type="dxa"/>
+            </w:tcMar>
+          </w:tcPr>
+          <w:p>
+            <w:pPr>
+              <w:jc w:val="center"/>
+            </w:pPr>
+            <w:r>
+              <w:rPr>
+                <w:rFonts w:ascii="Times New Roman" w:hAnsi="Times New Roman"/>
+                <w:b/>
+                <w:color w:val="FFFFFF"/>
+                <w:sz w:val="21"/>
+              </w:rPr>
+              <w:t>Nội dung chi tiết</w:t>
+            </w:r>
+          </w:p>
+        </w:tc>
+      </w:tr>
+      <w:tr>
+        <w:tc>
+          <w:tcPr>
+            <w:tcW w:type="dxa" w:w="3168"/>
+            <w:shd w:fill="FFFFFF"/>
+            <w:tcMar>
+              <w:top w:w="100" w:type="dxa"/>
+              <w:bottom w:w="100" w:type="dxa"/>
+              <w:left w:w="140" w:type="dxa"/>
+              <w:right w:w="140" w:type="dxa"/>
+            </w:tcMar>
+          </w:tcPr>
+          <w:p>
+            <w:pPr>
+              <w:jc w:val="center"/>
+            </w:pPr>
+            <w:r>
+              <w:rPr>
+                <w:rFonts w:ascii="Times New Roman" w:hAnsi="Times New Roman"/>
+                <w:color w:val="1E293B"/>
+                <w:sz w:val="20"/>
+              </w:rPr>
+              <w:t>Tên chức năng / Use Case</w:t>
+            </w:r>
+          </w:p>
+        </w:tc>
+        <w:tc>
+          <w:tcPr>
+            <w:tcW w:type="dxa" w:w="6192"/>
+            <w:shd w:fill="FFFFFF"/>
+            <w:tcMar>
+              <w:top w:w="100" w:type="dxa"/>
+              <w:bottom w:w="100" w:type="dxa"/>
+              <w:left w:w="140" w:type="dxa"/>
+              <w:right w:w="140" w:type="dxa"/>
+            </w:tcMar>
+          </w:tcPr>
+          <w:p>
+            <w:pPr>
+              <w:jc w:val="left"/>
+            </w:pPr>
+            <w:r>
+              <w:rPr>
+                <w:rFonts w:ascii="Times New Roman" w:hAnsi="Times New Roman"/>
+                <w:color w:val="1E293B"/>
+                <w:sz w:val="20"/>
+              </w:rPr>
+              <w:t>Xem thống kê doanh thu sự kiện (View Event Revenue Statistics)</w:t>
+            </w:r>
+          </w:p>
+        </w:tc>
+      </w:tr>
+      <w:tr>
+        <w:tc>
+          <w:tcPr>
+            <w:tcW w:type="dxa" w:w="3168"/>
+            <w:shd w:fill="F8FAFC"/>
+            <w:tcMar>
+              <w:top w:w="100" w:type="dxa"/>
+              <w:bottom w:w="100" w:type="dxa"/>
+              <w:left w:w="140" w:type="dxa"/>
+              <w:right w:w="140" w:type="dxa"/>
+            </w:tcMar>
+          </w:tcPr>
+          <w:p>
+            <w:pPr>
+              <w:jc w:val="center"/>
+            </w:pPr>
+            <w:r>
+              <w:rPr>
+                <w:rFonts w:ascii="Times New Roman" w:hAnsi="Times New Roman"/>
+                <w:color w:val="1E293B"/>
+                <w:sz w:val="20"/>
+              </w:rPr>
+              <w:t>Phân hệ trực thuộc</w:t>
+            </w:r>
+          </w:p>
+        </w:tc>
+        <w:tc>
+          <w:tcPr>
+            <w:tcW w:type="dxa" w:w="6192"/>
+            <w:shd w:fill="F8FAFC"/>
+            <w:tcMar>
+              <w:top w:w="100" w:type="dxa"/>
+              <w:bottom w:w="100" w:type="dxa"/>
+              <w:left w:w="140" w:type="dxa"/>
+              <w:right w:w="140" w:type="dxa"/>
+            </w:tcMar>
+          </w:tcPr>
+          <w:p>
+            <w:pPr>
+              <w:jc w:val="left"/>
+            </w:pPr>
+            <w:r>
+              <w:rPr>
+                <w:rFonts w:ascii="Times New Roman" w:hAnsi="Times New Roman"/>
+                <w:color w:val="1E293B"/>
+                <w:sz w:val="20"/>
+              </w:rPr>
+              <w:t>Module 5: Quản lý và thống kê dành cho Ban tổ chức</w:t>
+            </w:r>
+          </w:p>
+        </w:tc>
+      </w:tr>
+      <w:tr>
+        <w:tc>
+          <w:tcPr>
+            <w:tcW w:type="dxa" w:w="3168"/>
+            <w:shd w:fill="FFFFFF"/>
+            <w:tcMar>
+              <w:top w:w="100" w:type="dxa"/>
+              <w:bottom w:w="100" w:type="dxa"/>
+              <w:left w:w="140" w:type="dxa"/>
+              <w:right w:w="140" w:type="dxa"/>
+            </w:tcMar>
+          </w:tcPr>
+          <w:p>
+            <w:pPr>
+              <w:jc w:val="center"/>
+            </w:pPr>
+            <w:r>
+              <w:rPr>
+                <w:rFonts w:ascii="Times New Roman" w:hAnsi="Times New Roman"/>
+                <w:color w:val="1E293B"/>
+                <w:sz w:val="20"/>
+              </w:rPr>
+              <w:t>Tác nhân (Actor)</w:t>
+            </w:r>
+          </w:p>
+        </w:tc>
+        <w:tc>
+          <w:tcPr>
+            <w:tcW w:type="dxa" w:w="6192"/>
+            <w:shd w:fill="FFFFFF"/>
+            <w:tcMar>
+              <w:top w:w="100" w:type="dxa"/>
+              <w:bottom w:w="100" w:type="dxa"/>
+              <w:left w:w="140" w:type="dxa"/>
+              <w:right w:w="140" w:type="dxa"/>
+            </w:tcMar>
+          </w:tcPr>
+          <w:p>
+            <w:pPr>
+              <w:jc w:val="left"/>
+            </w:pPr>
+            <w:r>
+              <w:rPr>
+                <w:rFonts w:ascii="Times New Roman" w:hAnsi="Times New Roman"/>
+                <w:color w:val="1E293B"/>
+                <w:sz w:val="20"/>
+              </w:rPr>
+              <w:t>Ban tổ chức sự kiện (Organizer), Quản trị viên (Admin)</w:t>
+            </w:r>
+          </w:p>
+        </w:tc>
+      </w:tr>
+      <w:tr>
+        <w:tc>
+          <w:tcPr>
+            <w:tcW w:type="dxa" w:w="3168"/>
+            <w:shd w:fill="F8FAFC"/>
+            <w:tcMar>
+              <w:top w:w="100" w:type="dxa"/>
+              <w:bottom w:w="100" w:type="dxa"/>
+              <w:left w:w="140" w:type="dxa"/>
+              <w:right w:w="140" w:type="dxa"/>
+            </w:tcMar>
+          </w:tcPr>
+          <w:p>
+            <w:pPr>
+              <w:jc w:val="center"/>
+            </w:pPr>
+            <w:r>
+              <w:rPr>
+                <w:rFonts w:ascii="Times New Roman" w:hAnsi="Times New Roman"/>
+                <w:color w:val="1E293B"/>
+                <w:sz w:val="20"/>
+              </w:rPr>
+              <w:t>Mục tiêu nghiệp vụ</w:t>
+            </w:r>
+          </w:p>
+        </w:tc>
+        <w:tc>
+          <w:tcPr>
+            <w:tcW w:type="dxa" w:w="6192"/>
+            <w:shd w:fill="F8FAFC"/>
+            <w:tcMar>
+              <w:top w:w="100" w:type="dxa"/>
+              <w:bottom w:w="100" w:type="dxa"/>
+              <w:left w:w="140" w:type="dxa"/>
+              <w:right w:w="140" w:type="dxa"/>
+            </w:tcMar>
+          </w:tcPr>
+          <w:p>
+            <w:pPr>
+              <w:jc w:val="left"/>
+            </w:pPr>
+            <w:r>
+              <w:rPr>
+                <w:rFonts w:ascii="Times New Roman" w:hAnsi="Times New Roman"/>
+                <w:color w:val="1E293B"/>
+                <w:sz w:val="20"/>
+              </w:rPr>
+              <w:t>Cung cấp bức tranh tài chính toàn cảnh của sự kiện: doanh thu gộp, doanh thu thuần sau thuế và phí sàn, tỷ lệ lấp đầy khán đài, giá vé bình quân và xếp hạng hiệu suất mở bán.</w:t>
+            </w:r>
+          </w:p>
+        </w:tc>
+      </w:tr>
+      <w:tr>
+        <w:tc>
+          <w:tcPr>
+            <w:tcW w:type="dxa" w:w="3168"/>
+            <w:shd w:fill="FFFFFF"/>
+            <w:tcMar>
+              <w:top w:w="100" w:type="dxa"/>
+              <w:bottom w:w="100" w:type="dxa"/>
+              <w:left w:w="140" w:type="dxa"/>
+              <w:right w:w="140" w:type="dxa"/>
+            </w:tcMar>
+          </w:tcPr>
+          <w:p>
+            <w:pPr>
+              <w:jc w:val="center"/>
+            </w:pPr>
+            <w:r>
+              <w:rPr>
+                <w:rFonts w:ascii="Times New Roman" w:hAnsi="Times New Roman"/>
+                <w:color w:val="1E293B"/>
+                <w:sz w:val="20"/>
+              </w:rPr>
+              <w:t>Tiền điều kiện (Pre-conditions)</w:t>
+            </w:r>
+          </w:p>
+        </w:tc>
+        <w:tc>
+          <w:tcPr>
+            <w:tcW w:type="dxa" w:w="6192"/>
+            <w:shd w:fill="FFFFFF"/>
+            <w:tcMar>
+              <w:top w:w="100" w:type="dxa"/>
+              <w:bottom w:w="100" w:type="dxa"/>
+              <w:left w:w="140" w:type="dxa"/>
+              <w:right w:w="140" w:type="dxa"/>
+            </w:tcMar>
+          </w:tcPr>
+          <w:p>
+            <w:pPr>
+              <w:jc w:val="left"/>
+            </w:pPr>
+            <w:r>
+              <w:rPr>
+                <w:rFonts w:ascii="Times New Roman" w:hAnsi="Times New Roman"/>
+                <w:color w:val="1E293B"/>
+                <w:sz w:val="20"/>
+              </w:rPr>
+              <w:t>1. Ban tổ chức đã đăng nhập thành công vào hệ thống.</w:t>
               <w:br/>
-              <w:t>+ calculateRevenueByZone(): Map</w:t>
+              <w:t>2. Sự kiện đã được cấu hình sơ đồ ghế và đã phát sinh giao dịch bán vé.</w:t>
+            </w:r>
+          </w:p>
+        </w:tc>
+      </w:tr>
+      <w:tr>
+        <w:tc>
+          <w:tcPr>
+            <w:tcW w:type="dxa" w:w="3168"/>
+            <w:shd w:fill="F8FAFC"/>
+            <w:tcMar>
+              <w:top w:w="100" w:type="dxa"/>
+              <w:bottom w:w="100" w:type="dxa"/>
+              <w:left w:w="140" w:type="dxa"/>
+              <w:right w:w="140" w:type="dxa"/>
+            </w:tcMar>
+          </w:tcPr>
+          <w:p>
+            <w:pPr>
+              <w:jc w:val="center"/>
+            </w:pPr>
+            <w:r>
+              <w:rPr>
+                <w:rFonts w:ascii="Times New Roman" w:hAnsi="Times New Roman"/>
+                <w:color w:val="1E293B"/>
+                <w:sz w:val="20"/>
+              </w:rPr>
+              <w:t>Hậu điều kiện (Post-conditions)</w:t>
+            </w:r>
+          </w:p>
+        </w:tc>
+        <w:tc>
+          <w:tcPr>
+            <w:tcW w:type="dxa" w:w="6192"/>
+            <w:shd w:fill="F8FAFC"/>
+            <w:tcMar>
+              <w:top w:w="100" w:type="dxa"/>
+              <w:bottom w:w="100" w:type="dxa"/>
+              <w:left w:w="140" w:type="dxa"/>
+              <w:right w:w="140" w:type="dxa"/>
+            </w:tcMar>
+          </w:tcPr>
+          <w:p>
+            <w:pPr>
+              <w:jc w:val="left"/>
+            </w:pPr>
+            <w:r>
+              <w:rPr>
+                <w:rFonts w:ascii="Times New Roman" w:hAnsi="Times New Roman"/>
+                <w:color w:val="1E293B"/>
+                <w:sz w:val="20"/>
+              </w:rPr>
+              <w:t>Hệ thống tổng hợp và hiển thị trực quan các chỉ số tài chính (KPIs) cùng biểu đồ phân bổ doanh thu theo từng khu vực khán đài.</w:t>
+            </w:r>
+          </w:p>
+        </w:tc>
+      </w:tr>
+      <w:tr>
+        <w:tc>
+          <w:tcPr>
+            <w:tcW w:type="dxa" w:w="3168"/>
+            <w:shd w:fill="FFFFFF"/>
+            <w:tcMar>
+              <w:top w:w="100" w:type="dxa"/>
+              <w:bottom w:w="100" w:type="dxa"/>
+              <w:left w:w="140" w:type="dxa"/>
+              <w:right w:w="140" w:type="dxa"/>
+            </w:tcMar>
+          </w:tcPr>
+          <w:p>
+            <w:pPr>
+              <w:jc w:val="center"/>
+            </w:pPr>
+            <w:r>
+              <w:rPr>
+                <w:rFonts w:ascii="Times New Roman" w:hAnsi="Times New Roman"/>
+                <w:color w:val="1E293B"/>
+                <w:sz w:val="20"/>
+              </w:rPr>
+              <w:t>Luồng sự kiện chính (Main Flow)</w:t>
+            </w:r>
+          </w:p>
+        </w:tc>
+        <w:tc>
+          <w:tcPr>
+            <w:tcW w:type="dxa" w:w="6192"/>
+            <w:shd w:fill="FFFFFF"/>
+            <w:tcMar>
+              <w:top w:w="100" w:type="dxa"/>
+              <w:bottom w:w="100" w:type="dxa"/>
+              <w:left w:w="140" w:type="dxa"/>
+              <w:right w:w="140" w:type="dxa"/>
+            </w:tcMar>
+          </w:tcPr>
+          <w:p>
+            <w:pPr>
+              <w:jc w:val="left"/>
+            </w:pPr>
+            <w:r>
+              <w:rPr>
+                <w:rFonts w:ascii="Times New Roman" w:hAnsi="Times New Roman"/>
+                <w:color w:val="1E293B"/>
+                <w:sz w:val="20"/>
+              </w:rPr>
+              <w:t>1. Ban tổ chức chọn sự kiện cần xem từ danh sách sự kiện do mình quản lý.</w:t>
+              <w:br/>
+              <w:t>2. Giao diện RevenueReportView gửi yêu cầu tra cứu tới RevenueReportController.</w:t>
+              <w:br/>
+              <w:t>3. Controller khởi tạo đối tượng RevenueReport nạp dữ liệu cấu hình vé và các giao dịch.</w:t>
+              <w:br/>
+              <w:t>4. RevenueReport thực hiện chuỗi phương thức tính toán nội tại: calculateGrossRevenue(), calculateNetRevenue(), calculateOccupancyRate(), evaluatePerformance().</w:t>
+              <w:br/>
+              <w:t>5. Controller đóng gói kết quả vào RevenueSummaryDto và trả về cho RevenueReportView.</w:t>
+              <w:br/>
+              <w:t>6. Giao diện kết xuất các thẻ KPI và biểu đồ phân bổ doanh thu trực quan.</w:t>
+            </w:r>
+          </w:p>
+        </w:tc>
+      </w:tr>
+    </w:tbl>
+    <w:p>
+      <w:pPr>
+        <w:spacing w:before="0" w:after="120"/>
+      </w:pPr>
+    </w:p>
+    <w:p>
+      <w:pPr>
+        <w:keepNext/>
+        <w:spacing w:before="160" w:after="60"/>
+      </w:pPr>
+      <w:r>
+        <w:rPr>
+          <w:rFonts w:ascii="Times New Roman" w:hAnsi="Times New Roman"/>
+          <w:b/>
+          <w:i/>
+          <w:color w:val="334155"/>
+          <w:sz w:val="23"/>
+        </w:rPr>
+        <w:t>b. Biểu đồ tuần tự (Sequence Diagram) thể hiện tương tác BCE</w:t>
+      </w:r>
+    </w:p>
+    <w:p>
+      <w:pPr>
+        <w:spacing w:before="0" w:after="100" w:line="300" w:lineRule="auto"/>
+      </w:pPr>
+      <w:r>
+        <w:rPr>
+          <w:rFonts w:ascii="Times New Roman" w:hAnsi="Times New Roman"/>
+          <w:color w:val="1E293B"/>
+          <w:sz w:val="23"/>
+        </w:rPr>
+        <w:t>Biểu đồ tuần tự thể hiện sự tương tác mạch lạc giữa tác nhân Ban tổ chức, lớp Boundary (Giao diện), lớp Control (Điều phối) và các lớp Entity (Thực thể tính toán):</w:t>
+      </w:r>
+    </w:p>
+    <w:p>
+      <w:pPr>
+        <w:keepNext/>
+        <w:spacing w:before="160" w:after="40"/>
+        <w:jc w:val="center"/>
+      </w:pPr>
+      <w:r>
+        <w:drawing>
+          <wp:inline xmlns:a="http://schemas.openxmlformats.org/drawingml/2006/main" xmlns:pic="http://schemas.openxmlformats.org/drawingml/2006/picture">
+            <wp:extent cx="5669280" cy="3764771"/>
+            <wp:docPr id="19" name="Picture 19"/>
+            <wp:cNvGraphicFramePr>
+              <a:graphicFrameLocks noChangeAspect="1"/>
+            </wp:cNvGraphicFramePr>
+            <a:graphic>
+              <a:graphicData uri="http://schemas.openxmlformats.org/drawingml/2006/picture">
+                <pic:pic>
+                  <pic:nvPicPr>
+                    <pic:cNvPr id="0" name="seq_m5_view_revenue.png"/>
+                    <pic:cNvPicPr/>
+                  </pic:nvPicPr>
+                  <pic:blipFill>
+                    <a:blip r:embed="rId27"/>
+                    <a:stretch>
+                      <a:fillRect/>
+                    </a:stretch>
+                  </pic:blipFill>
+                  <pic:spPr>
+                    <a:xfrm>
+                      <a:off x="0" y="0"/>
+                      <a:ext cx="5669280" cy="3764771"/>
+                    </a:xfrm>
+                    <a:prstGeom prst="rect"/>
+                  </pic:spPr>
+                </pic:pic>
+              </a:graphicData>
+            </a:graphic>
+          </wp:inline>
+        </w:drawing>
+      </w:r>
+    </w:p>
+    <w:p>
+      <w:pPr>
+        <w:spacing w:before="40" w:after="200"/>
+        <w:jc w:val="center"/>
+      </w:pPr>
+      <w:r>
+        <w:rPr>
+          <w:rFonts w:ascii="Times New Roman" w:hAnsi="Times New Roman"/>
+          <w:b/>
+          <w:i/>
+          <w:color w:val="475569"/>
+          <w:sz w:val="20"/>
+        </w:rPr>
+        <w:t>Hình 4.7: Biểu đồ tuần tự ca sử dụng Xem thống kê doanh thu sự kiện</w:t>
+      </w:r>
+    </w:p>
+    <w:p>
+      <w:pPr>
+        <w:keepNext/>
+        <w:spacing w:before="160" w:after="60"/>
+      </w:pPr>
+      <w:r>
+        <w:rPr>
+          <w:rFonts w:ascii="Times New Roman" w:hAnsi="Times New Roman"/>
+          <w:b/>
+          <w:i/>
+          <w:color w:val="334155"/>
+          <w:sz w:val="23"/>
+        </w:rPr>
+        <w:t>c. Biểu đồ lớp thiết kế chi tiết theo mô hình BCE</w:t>
+      </w:r>
+    </w:p>
+    <w:p>
+      <w:pPr>
+        <w:spacing w:before="0" w:after="100" w:line="300" w:lineRule="auto"/>
+      </w:pPr>
+      <w:r>
+        <w:rPr>
+          <w:rFonts w:ascii="Times New Roman" w:hAnsi="Times New Roman"/>
+          <w:color w:val="1E293B"/>
+          <w:sz w:val="23"/>
+        </w:rPr>
+        <w:t>Mô hình thiết kế 3 lớp (Boundary - Control - Entity) làm nổi bật các phương thức tính toán nghiệp vụ trong các lớp thực thể RevenueReport và ZonePricing:</w:t>
+      </w:r>
+    </w:p>
+    <w:p>
+      <w:pPr>
+        <w:keepNext/>
+        <w:spacing w:before="160" w:after="40"/>
+        <w:jc w:val="center"/>
+      </w:pPr>
+      <w:r>
+        <w:drawing>
+          <wp:inline xmlns:a="http://schemas.openxmlformats.org/drawingml/2006/main" xmlns:pic="http://schemas.openxmlformats.org/drawingml/2006/picture">
+            <wp:extent cx="5669280" cy="3700158"/>
+            <wp:docPr id="20" name="Picture 20"/>
+            <wp:cNvGraphicFramePr>
+              <a:graphicFrameLocks noChangeAspect="1"/>
+            </wp:cNvGraphicFramePr>
+            <a:graphic>
+              <a:graphicData uri="http://schemas.openxmlformats.org/drawingml/2006/picture">
+                <pic:pic>
+                  <pic:nvPicPr>
+                    <pic:cNvPr id="0" name="design_m5_view_revenue_detail.png"/>
+                    <pic:cNvPicPr/>
+                  </pic:nvPicPr>
+                  <pic:blipFill>
+                    <a:blip r:embed="rId28"/>
+                    <a:stretch>
+                      <a:fillRect/>
+                    </a:stretch>
+                  </pic:blipFill>
+                  <pic:spPr>
+                    <a:xfrm>
+                      <a:off x="0" y="0"/>
+                      <a:ext cx="5669280" cy="3700158"/>
+                    </a:xfrm>
+                    <a:prstGeom prst="rect"/>
+                  </pic:spPr>
+                </pic:pic>
+              </a:graphicData>
+            </a:graphic>
+          </wp:inline>
+        </w:drawing>
+      </w:r>
+    </w:p>
+    <w:p>
+      <w:pPr>
+        <w:spacing w:before="40" w:after="200"/>
+        <w:jc w:val="center"/>
+      </w:pPr>
+      <w:r>
+        <w:rPr>
+          <w:rFonts w:ascii="Times New Roman" w:hAnsi="Times New Roman"/>
+          <w:b/>
+          <w:i/>
+          <w:color w:val="475569"/>
+          <w:sz w:val="20"/>
+        </w:rPr>
+        <w:t>Hình 4.8: Biểu đồ lớp thiết kế chi tiết (BCE) chức năng Thống kê doanh thu</w:t>
+      </w:r>
+    </w:p>
+    <w:p>
+      <w:pPr>
+        <w:keepNext/>
+        <w:spacing w:before="160" w:after="60"/>
+      </w:pPr>
+      <w:r>
+        <w:rPr>
+          <w:rFonts w:ascii="Times New Roman" w:hAnsi="Times New Roman"/>
+          <w:b/>
+          <w:i/>
+          <w:color w:val="334155"/>
+          <w:sz w:val="23"/>
+        </w:rPr>
+        <w:t>d. Bảng phân tích chi tiết các phương thức tính toán (Computational Methods)</w:t>
+      </w:r>
+    </w:p>
+    <w:p>
+      <w:pPr>
+        <w:spacing w:before="0" w:after="100" w:line="300" w:lineRule="auto"/>
+      </w:pPr>
+      <w:r>
+        <w:rPr>
+          <w:rFonts w:ascii="Times New Roman" w:hAnsi="Times New Roman"/>
+          <w:color w:val="1E293B"/>
+          <w:sz w:val="23"/>
+        </w:rPr>
+        <w:t>Để các lớp không bị biến thành 'cấu trúc dữ liệu thụ động' (Anemic Domain Model), toàn bộ logic tính toán tài chính được đóng gói trực tiếp vào các thực thể:</w:t>
+      </w:r>
+    </w:p>
+    <w:tbl>
+      <w:tblPr>
+        <w:tblW w:type="auto" w:w="0"/>
+        <w:jc w:val="center"/>
+        <w:tblLook w:firstColumn="1" w:firstRow="1" w:lastColumn="0" w:lastRow="0" w:noHBand="0" w:noVBand="1" w:val="04A0"/>
+        <w:tblBorders>
+          <w:top w:val="single" w:sz="6" w:space="0" w:color="CBD5E1"/>
+          <w:left w:val="none"/>
+          <w:bottom w:val="single" w:sz="8" w:space="0" w:color="1E3A8A"/>
+          <w:right w:val="none"/>
+          <w:insideH w:val="single" w:sz="4" w:space="0" w:color="CBD5E1"/>
+          <w:insideV w:val="none"/>
+        </w:tblBorders>
+      </w:tblPr>
+      <w:tblGrid>
+        <w:gridCol w:w="2351"/>
+        <w:gridCol w:w="2351"/>
+        <w:gridCol w:w="2351"/>
+        <w:gridCol w:w="2351"/>
+      </w:tblGrid>
+      <w:tr>
+        <w:tc>
+          <w:tcPr>
+            <w:tcW w:type="dxa" w:w="2592"/>
+            <w:shd w:fill="1E3A8A"/>
+            <w:tcMar>
+              <w:top w:w="140" w:type="dxa"/>
+              <w:bottom w:w="140" w:type="dxa"/>
+              <w:left w:w="160" w:type="dxa"/>
+              <w:right w:w="160" w:type="dxa"/>
+            </w:tcMar>
+          </w:tcPr>
+          <w:p>
+            <w:pPr>
+              <w:jc w:val="center"/>
+            </w:pPr>
+            <w:r>
+              <w:rPr>
+                <w:rFonts w:ascii="Times New Roman" w:hAnsi="Times New Roman"/>
+                <w:b/>
+                <w:color w:val="FFFFFF"/>
+                <w:sz w:val="21"/>
+              </w:rPr>
+              <w:t>Tên phương thức tính toán</w:t>
+            </w:r>
+          </w:p>
+        </w:tc>
+        <w:tc>
+          <w:tcPr>
+            <w:tcW w:type="dxa" w:w="1584"/>
+            <w:shd w:fill="1E3A8A"/>
+            <w:tcMar>
+              <w:top w:w="140" w:type="dxa"/>
+              <w:bottom w:w="140" w:type="dxa"/>
+              <w:left w:w="160" w:type="dxa"/>
+              <w:right w:w="160" w:type="dxa"/>
+            </w:tcMar>
+          </w:tcPr>
+          <w:p>
+            <w:pPr>
+              <w:jc w:val="center"/>
+            </w:pPr>
+            <w:r>
+              <w:rPr>
+                <w:rFonts w:ascii="Times New Roman" w:hAnsi="Times New Roman"/>
+                <w:b/>
+                <w:color w:val="FFFFFF"/>
+                <w:sz w:val="21"/>
+              </w:rPr>
+              <w:t>Lớp sở hữu</w:t>
+            </w:r>
+          </w:p>
+        </w:tc>
+        <w:tc>
+          <w:tcPr>
+            <w:tcW w:type="dxa" w:w="1584"/>
+            <w:shd w:fill="1E3A8A"/>
+            <w:tcMar>
+              <w:top w:w="140" w:type="dxa"/>
+              <w:bottom w:w="140" w:type="dxa"/>
+              <w:left w:w="160" w:type="dxa"/>
+              <w:right w:w="160" w:type="dxa"/>
+            </w:tcMar>
+          </w:tcPr>
+          <w:p>
+            <w:pPr>
+              <w:jc w:val="center"/>
+            </w:pPr>
+            <w:r>
+              <w:rPr>
+                <w:rFonts w:ascii="Times New Roman" w:hAnsi="Times New Roman"/>
+                <w:b/>
+                <w:color w:val="FFFFFF"/>
+                <w:sz w:val="21"/>
+              </w:rPr>
+              <w:t>Kiểu trả về</w:t>
+            </w:r>
+          </w:p>
+        </w:tc>
+        <w:tc>
+          <w:tcPr>
+            <w:tcW w:type="dxa" w:w="3600"/>
+            <w:shd w:fill="1E3A8A"/>
+            <w:tcMar>
+              <w:top w:w="140" w:type="dxa"/>
+              <w:bottom w:w="140" w:type="dxa"/>
+              <w:left w:w="160" w:type="dxa"/>
+              <w:right w:w="160" w:type="dxa"/>
+            </w:tcMar>
+          </w:tcPr>
+          <w:p>
+            <w:pPr>
+              <w:jc w:val="center"/>
+            </w:pPr>
+            <w:r>
+              <w:rPr>
+                <w:rFonts w:ascii="Times New Roman" w:hAnsi="Times New Roman"/>
+                <w:b/>
+                <w:color w:val="FFFFFF"/>
+                <w:sz w:val="21"/>
+              </w:rPr>
+              <w:t>Công thức / Thuật toán tính toán</w:t>
+            </w:r>
+          </w:p>
+        </w:tc>
+      </w:tr>
+      <w:tr>
+        <w:tc>
+          <w:tcPr>
+            <w:tcW w:type="dxa" w:w="2592"/>
+            <w:shd w:fill="FFFFFF"/>
+            <w:tcMar>
+              <w:top w:w="100" w:type="dxa"/>
+              <w:bottom w:w="100" w:type="dxa"/>
+              <w:left w:w="140" w:type="dxa"/>
+              <w:right w:w="140" w:type="dxa"/>
+            </w:tcMar>
+          </w:tcPr>
+          <w:p>
+            <w:pPr>
+              <w:jc w:val="center"/>
+            </w:pPr>
+            <w:r>
+              <w:rPr>
+                <w:rFonts w:ascii="Times New Roman" w:hAnsi="Times New Roman"/>
+                <w:color w:val="1E293B"/>
+                <w:sz w:val="20"/>
+              </w:rPr>
+              <w:t>calculateTotalCapacity()</w:t>
+            </w:r>
+          </w:p>
+        </w:tc>
+        <w:tc>
+          <w:tcPr>
+            <w:tcW w:type="dxa" w:w="1584"/>
+            <w:shd w:fill="FFFFFF"/>
+            <w:tcMar>
+              <w:top w:w="100" w:type="dxa"/>
+              <w:bottom w:w="100" w:type="dxa"/>
+              <w:left w:w="140" w:type="dxa"/>
+              <w:right w:w="140" w:type="dxa"/>
+            </w:tcMar>
+          </w:tcPr>
+          <w:p>
+            <w:pPr>
+              <w:jc w:val="left"/>
+            </w:pPr>
+            <w:r>
+              <w:rPr>
+                <w:rFonts w:ascii="Times New Roman" w:hAnsi="Times New Roman"/>
+                <w:color w:val="1E293B"/>
+                <w:sz w:val="20"/>
+              </w:rPr>
+              <w:t>RevenueReport</w:t>
+            </w:r>
+          </w:p>
+        </w:tc>
+        <w:tc>
+          <w:tcPr>
+            <w:tcW w:type="dxa" w:w="1584"/>
+            <w:shd w:fill="FFFFFF"/>
+            <w:tcMar>
+              <w:top w:w="100" w:type="dxa"/>
+              <w:bottom w:w="100" w:type="dxa"/>
+              <w:left w:w="140" w:type="dxa"/>
+              <w:right w:w="140" w:type="dxa"/>
+            </w:tcMar>
+          </w:tcPr>
+          <w:p>
+            <w:pPr>
+              <w:jc w:val="left"/>
+            </w:pPr>
+            <w:r>
+              <w:rPr>
+                <w:rFonts w:ascii="Times New Roman" w:hAnsi="Times New Roman"/>
+                <w:color w:val="1E293B"/>
+                <w:sz w:val="20"/>
+              </w:rPr>
+              <w:t>int</w:t>
+            </w:r>
+          </w:p>
+        </w:tc>
+        <w:tc>
+          <w:tcPr>
+            <w:tcW w:type="dxa" w:w="3600"/>
+            <w:shd w:fill="FFFFFF"/>
+            <w:tcMar>
+              <w:top w:w="100" w:type="dxa"/>
+              <w:bottom w:w="100" w:type="dxa"/>
+              <w:left w:w="140" w:type="dxa"/>
+              <w:right w:w="140" w:type="dxa"/>
+            </w:tcMar>
+          </w:tcPr>
+          <w:p>
+            <w:pPr>
+              <w:jc w:val="left"/>
+            </w:pPr>
+            <w:r>
+              <w:rPr>
+                <w:rFonts w:ascii="Times New Roman" w:hAnsi="Times New Roman"/>
+                <w:color w:val="1E293B"/>
+                <w:sz w:val="20"/>
+              </w:rPr>
+              <w:t>Tổng sức chứa của khán đài = tổng số ghế của tất cả các phân khu (ZonePricing):</w:t>
+              <w:br/>
+              <w:t>TotalCapacity = sum(zone.seatCount)</w:t>
+            </w:r>
+          </w:p>
+        </w:tc>
+      </w:tr>
+      <w:tr>
+        <w:tc>
+          <w:tcPr>
+            <w:tcW w:type="dxa" w:w="2592"/>
+            <w:shd w:fill="F8FAFC"/>
+            <w:tcMar>
+              <w:top w:w="100" w:type="dxa"/>
+              <w:bottom w:w="100" w:type="dxa"/>
+              <w:left w:w="140" w:type="dxa"/>
+              <w:right w:w="140" w:type="dxa"/>
+            </w:tcMar>
+          </w:tcPr>
+          <w:p>
+            <w:pPr>
+              <w:jc w:val="center"/>
+            </w:pPr>
+            <w:r>
+              <w:rPr>
+                <w:rFonts w:ascii="Times New Roman" w:hAnsi="Times New Roman"/>
+                <w:color w:val="1E293B"/>
+                <w:sz w:val="20"/>
+              </w:rPr>
+              <w:t>calculateTotalTicketsSold()</w:t>
+            </w:r>
+          </w:p>
+        </w:tc>
+        <w:tc>
+          <w:tcPr>
+            <w:tcW w:type="dxa" w:w="1584"/>
+            <w:shd w:fill="F8FAFC"/>
+            <w:tcMar>
+              <w:top w:w="100" w:type="dxa"/>
+              <w:bottom w:w="100" w:type="dxa"/>
+              <w:left w:w="140" w:type="dxa"/>
+              <w:right w:w="140" w:type="dxa"/>
+            </w:tcMar>
+          </w:tcPr>
+          <w:p>
+            <w:pPr>
+              <w:jc w:val="left"/>
+            </w:pPr>
+            <w:r>
+              <w:rPr>
+                <w:rFonts w:ascii="Times New Roman" w:hAnsi="Times New Roman"/>
+                <w:color w:val="1E293B"/>
+                <w:sz w:val="20"/>
+              </w:rPr>
+              <w:t>RevenueReport</w:t>
+            </w:r>
+          </w:p>
+        </w:tc>
+        <w:tc>
+          <w:tcPr>
+            <w:tcW w:type="dxa" w:w="1584"/>
+            <w:shd w:fill="F8FAFC"/>
+            <w:tcMar>
+              <w:top w:w="100" w:type="dxa"/>
+              <w:bottom w:w="100" w:type="dxa"/>
+              <w:left w:w="140" w:type="dxa"/>
+              <w:right w:w="140" w:type="dxa"/>
+            </w:tcMar>
+          </w:tcPr>
+          <w:p>
+            <w:pPr>
+              <w:jc w:val="left"/>
+            </w:pPr>
+            <w:r>
+              <w:rPr>
+                <w:rFonts w:ascii="Times New Roman" w:hAnsi="Times New Roman"/>
+                <w:color w:val="1E293B"/>
+                <w:sz w:val="20"/>
+              </w:rPr>
+              <w:t>int</w:t>
+            </w:r>
+          </w:p>
+        </w:tc>
+        <w:tc>
+          <w:tcPr>
+            <w:tcW w:type="dxa" w:w="3600"/>
+            <w:shd w:fill="F8FAFC"/>
+            <w:tcMar>
+              <w:top w:w="100" w:type="dxa"/>
+              <w:bottom w:w="100" w:type="dxa"/>
+              <w:left w:w="140" w:type="dxa"/>
+              <w:right w:w="140" w:type="dxa"/>
+            </w:tcMar>
+          </w:tcPr>
+          <w:p>
+            <w:pPr>
+              <w:jc w:val="left"/>
+            </w:pPr>
+            <w:r>
+              <w:rPr>
+                <w:rFonts w:ascii="Times New Roman" w:hAnsi="Times New Roman"/>
+                <w:color w:val="1E293B"/>
+                <w:sz w:val="20"/>
+              </w:rPr>
+              <w:t>Tổng số vé thực tế đã bán thành công = tổng số vé bán ra của từng phân khu:</w:t>
+              <w:br/>
+              <w:t>TotalSold = sum(zone.soldCount)</w:t>
+            </w:r>
+          </w:p>
+        </w:tc>
+      </w:tr>
+      <w:tr>
+        <w:tc>
+          <w:tcPr>
+            <w:tcW w:type="dxa" w:w="2592"/>
+            <w:shd w:fill="FFFFFF"/>
+            <w:tcMar>
+              <w:top w:w="100" w:type="dxa"/>
+              <w:bottom w:w="100" w:type="dxa"/>
+              <w:left w:w="140" w:type="dxa"/>
+              <w:right w:w="140" w:type="dxa"/>
+            </w:tcMar>
+          </w:tcPr>
+          <w:p>
+            <w:pPr>
+              <w:jc w:val="center"/>
+            </w:pPr>
+            <w:r>
+              <w:rPr>
+                <w:rFonts w:ascii="Times New Roman" w:hAnsi="Times New Roman"/>
+                <w:color w:val="1E293B"/>
+                <w:sz w:val="20"/>
+              </w:rPr>
+              <w:t>calculateGrossRevenue()</w:t>
+            </w:r>
+          </w:p>
+        </w:tc>
+        <w:tc>
+          <w:tcPr>
+            <w:tcW w:type="dxa" w:w="1584"/>
+            <w:shd w:fill="FFFFFF"/>
+            <w:tcMar>
+              <w:top w:w="100" w:type="dxa"/>
+              <w:bottom w:w="100" w:type="dxa"/>
+              <w:left w:w="140" w:type="dxa"/>
+              <w:right w:w="140" w:type="dxa"/>
+            </w:tcMar>
+          </w:tcPr>
+          <w:p>
+            <w:pPr>
+              <w:jc w:val="left"/>
+            </w:pPr>
+            <w:r>
+              <w:rPr>
+                <w:rFonts w:ascii="Times New Roman" w:hAnsi="Times New Roman"/>
+                <w:color w:val="1E293B"/>
+                <w:sz w:val="20"/>
+              </w:rPr>
+              <w:t>RevenueReport</w:t>
+            </w:r>
+          </w:p>
+        </w:tc>
+        <w:tc>
+          <w:tcPr>
+            <w:tcW w:type="dxa" w:w="1584"/>
+            <w:shd w:fill="FFFFFF"/>
+            <w:tcMar>
+              <w:top w:w="100" w:type="dxa"/>
+              <w:bottom w:w="100" w:type="dxa"/>
+              <w:left w:w="140" w:type="dxa"/>
+              <w:right w:w="140" w:type="dxa"/>
+            </w:tcMar>
+          </w:tcPr>
+          <w:p>
+            <w:pPr>
+              <w:jc w:val="left"/>
+            </w:pPr>
+            <w:r>
+              <w:rPr>
+                <w:rFonts w:ascii="Times New Roman" w:hAnsi="Times New Roman"/>
+                <w:color w:val="1E293B"/>
+                <w:sz w:val="20"/>
+              </w:rPr>
+              <w:t>double</w:t>
+            </w:r>
+          </w:p>
+        </w:tc>
+        <w:tc>
+          <w:tcPr>
+            <w:tcW w:type="dxa" w:w="3600"/>
+            <w:shd w:fill="FFFFFF"/>
+            <w:tcMar>
+              <w:top w:w="100" w:type="dxa"/>
+              <w:bottom w:w="100" w:type="dxa"/>
+              <w:left w:w="140" w:type="dxa"/>
+              <w:right w:w="140" w:type="dxa"/>
+            </w:tcMar>
+          </w:tcPr>
+          <w:p>
+            <w:pPr>
+              <w:jc w:val="left"/>
+            </w:pPr>
+            <w:r>
+              <w:rPr>
+                <w:rFonts w:ascii="Times New Roman" w:hAnsi="Times New Roman"/>
+                <w:color w:val="1E293B"/>
+                <w:sz w:val="20"/>
+              </w:rPr>
+              <w:t>Tổng doanh thu gộp = tổng tích số giữa số vé đã bán và đơn giá vé từng khu vực:</w:t>
+              <w:br/>
+              <w:t>GrossRevenue = sum(zone.soldCount * zone.price)</w:t>
+            </w:r>
+          </w:p>
+        </w:tc>
+      </w:tr>
+      <w:tr>
+        <w:tc>
+          <w:tcPr>
+            <w:tcW w:type="dxa" w:w="2592"/>
+            <w:shd w:fill="F8FAFC"/>
+            <w:tcMar>
+              <w:top w:w="100" w:type="dxa"/>
+              <w:bottom w:w="100" w:type="dxa"/>
+              <w:left w:w="140" w:type="dxa"/>
+              <w:right w:w="140" w:type="dxa"/>
+            </w:tcMar>
+          </w:tcPr>
+          <w:p>
+            <w:pPr>
+              <w:jc w:val="center"/>
+            </w:pPr>
+            <w:r>
+              <w:rPr>
+                <w:rFonts w:ascii="Times New Roman" w:hAnsi="Times New Roman"/>
+                <w:color w:val="1E293B"/>
+                <w:sz w:val="20"/>
+              </w:rPr>
+              <w:t>calculateNetRevenue()</w:t>
+            </w:r>
+          </w:p>
+        </w:tc>
+        <w:tc>
+          <w:tcPr>
+            <w:tcW w:type="dxa" w:w="1584"/>
+            <w:shd w:fill="F8FAFC"/>
+            <w:tcMar>
+              <w:top w:w="100" w:type="dxa"/>
+              <w:bottom w:w="100" w:type="dxa"/>
+              <w:left w:w="140" w:type="dxa"/>
+              <w:right w:w="140" w:type="dxa"/>
+            </w:tcMar>
+          </w:tcPr>
+          <w:p>
+            <w:pPr>
+              <w:jc w:val="left"/>
+            </w:pPr>
+            <w:r>
+              <w:rPr>
+                <w:rFonts w:ascii="Times New Roman" w:hAnsi="Times New Roman"/>
+                <w:color w:val="1E293B"/>
+                <w:sz w:val="20"/>
+              </w:rPr>
+              <w:t>RevenueReport</w:t>
+            </w:r>
+          </w:p>
+        </w:tc>
+        <w:tc>
+          <w:tcPr>
+            <w:tcW w:type="dxa" w:w="1584"/>
+            <w:shd w:fill="F8FAFC"/>
+            <w:tcMar>
+              <w:top w:w="100" w:type="dxa"/>
+              <w:bottom w:w="100" w:type="dxa"/>
+              <w:left w:w="140" w:type="dxa"/>
+              <w:right w:w="140" w:type="dxa"/>
+            </w:tcMar>
+          </w:tcPr>
+          <w:p>
+            <w:pPr>
+              <w:jc w:val="left"/>
+            </w:pPr>
+            <w:r>
+              <w:rPr>
+                <w:rFonts w:ascii="Times New Roman" w:hAnsi="Times New Roman"/>
+                <w:color w:val="1E293B"/>
+                <w:sz w:val="20"/>
+              </w:rPr>
+              <w:t>double</w:t>
+            </w:r>
+          </w:p>
+        </w:tc>
+        <w:tc>
+          <w:tcPr>
+            <w:tcW w:type="dxa" w:w="3600"/>
+            <w:shd w:fill="F8FAFC"/>
+            <w:tcMar>
+              <w:top w:w="100" w:type="dxa"/>
+              <w:bottom w:w="100" w:type="dxa"/>
+              <w:left w:w="140" w:type="dxa"/>
+              <w:right w:w="140" w:type="dxa"/>
+            </w:tcMar>
+          </w:tcPr>
+          <w:p>
+            <w:pPr>
+              <w:jc w:val="left"/>
+            </w:pPr>
+            <w:r>
+              <w:rPr>
+                <w:rFonts w:ascii="Times New Roman" w:hAnsi="Times New Roman"/>
+                <w:color w:val="1E293B"/>
+                <w:sz w:val="20"/>
+              </w:rPr>
+              <w:t>Doanh thu thuần thực nhận sau khi khấu trừ thuế VAT và phí nền tảng:</w:t>
+              <w:br/>
+              <w:t>NetRevenue = GrossRevenue * (1 - taxRate - platformFeeRate)</w:t>
+            </w:r>
+          </w:p>
+        </w:tc>
+      </w:tr>
+      <w:tr>
+        <w:tc>
+          <w:tcPr>
+            <w:tcW w:type="dxa" w:w="2592"/>
+            <w:shd w:fill="FFFFFF"/>
+            <w:tcMar>
+              <w:top w:w="100" w:type="dxa"/>
+              <w:bottom w:w="100" w:type="dxa"/>
+              <w:left w:w="140" w:type="dxa"/>
+              <w:right w:w="140" w:type="dxa"/>
+            </w:tcMar>
+          </w:tcPr>
+          <w:p>
+            <w:pPr>
+              <w:jc w:val="center"/>
+            </w:pPr>
+            <w:r>
+              <w:rPr>
+                <w:rFonts w:ascii="Times New Roman" w:hAnsi="Times New Roman"/>
+                <w:color w:val="1E293B"/>
+                <w:sz w:val="20"/>
+              </w:rPr>
+              <w:t>calculateOccupancyRate()</w:t>
+            </w:r>
+          </w:p>
+        </w:tc>
+        <w:tc>
+          <w:tcPr>
+            <w:tcW w:type="dxa" w:w="1584"/>
+            <w:shd w:fill="FFFFFF"/>
+            <w:tcMar>
+              <w:top w:w="100" w:type="dxa"/>
+              <w:bottom w:w="100" w:type="dxa"/>
+              <w:left w:w="140" w:type="dxa"/>
+              <w:right w:w="140" w:type="dxa"/>
+            </w:tcMar>
+          </w:tcPr>
+          <w:p>
+            <w:pPr>
+              <w:jc w:val="left"/>
+            </w:pPr>
+            <w:r>
+              <w:rPr>
+                <w:rFonts w:ascii="Times New Roman" w:hAnsi="Times New Roman"/>
+                <w:color w:val="1E293B"/>
+                <w:sz w:val="20"/>
+              </w:rPr>
+              <w:t>RevenueReport</w:t>
+            </w:r>
+          </w:p>
+        </w:tc>
+        <w:tc>
+          <w:tcPr>
+            <w:tcW w:type="dxa" w:w="1584"/>
+            <w:shd w:fill="FFFFFF"/>
+            <w:tcMar>
+              <w:top w:w="100" w:type="dxa"/>
+              <w:bottom w:w="100" w:type="dxa"/>
+              <w:left w:w="140" w:type="dxa"/>
+              <w:right w:w="140" w:type="dxa"/>
+            </w:tcMar>
+          </w:tcPr>
+          <w:p>
+            <w:pPr>
+              <w:jc w:val="left"/>
+            </w:pPr>
+            <w:r>
+              <w:rPr>
+                <w:rFonts w:ascii="Times New Roman" w:hAnsi="Times New Roman"/>
+                <w:color w:val="1E293B"/>
+                <w:sz w:val="20"/>
+              </w:rPr>
+              <w:t>double</w:t>
+            </w:r>
+          </w:p>
+        </w:tc>
+        <w:tc>
+          <w:tcPr>
+            <w:tcW w:type="dxa" w:w="3600"/>
+            <w:shd w:fill="FFFFFF"/>
+            <w:tcMar>
+              <w:top w:w="100" w:type="dxa"/>
+              <w:bottom w:w="100" w:type="dxa"/>
+              <w:left w:w="140" w:type="dxa"/>
+              <w:right w:w="140" w:type="dxa"/>
+            </w:tcMar>
+          </w:tcPr>
+          <w:p>
+            <w:pPr>
+              <w:jc w:val="left"/>
+            </w:pPr>
+            <w:r>
+              <w:rPr>
+                <w:rFonts w:ascii="Times New Roman" w:hAnsi="Times New Roman"/>
+                <w:color w:val="1E293B"/>
+                <w:sz w:val="20"/>
+              </w:rPr>
+              <w:t>Tỷ lệ lấp đầy khán đài theo phần trăm:</w:t>
+              <w:br/>
+              <w:t>OccupancyRate = (TotalSold / (double) TotalCapacity) * 100.0%</w:t>
+            </w:r>
+          </w:p>
+        </w:tc>
+      </w:tr>
+      <w:tr>
+        <w:tc>
+          <w:tcPr>
+            <w:tcW w:type="dxa" w:w="2592"/>
+            <w:shd w:fill="F8FAFC"/>
+            <w:tcMar>
+              <w:top w:w="100" w:type="dxa"/>
+              <w:bottom w:w="100" w:type="dxa"/>
+              <w:left w:w="140" w:type="dxa"/>
+              <w:right w:w="140" w:type="dxa"/>
+            </w:tcMar>
+          </w:tcPr>
+          <w:p>
+            <w:pPr>
+              <w:jc w:val="center"/>
+            </w:pPr>
+            <w:r>
+              <w:rPr>
+                <w:rFonts w:ascii="Times New Roman" w:hAnsi="Times New Roman"/>
+                <w:color w:val="1E293B"/>
+                <w:sz w:val="20"/>
+              </w:rPr>
+              <w:t>calculateAverageTicketPrice()</w:t>
+            </w:r>
+          </w:p>
+        </w:tc>
+        <w:tc>
+          <w:tcPr>
+            <w:tcW w:type="dxa" w:w="1584"/>
+            <w:shd w:fill="F8FAFC"/>
+            <w:tcMar>
+              <w:top w:w="100" w:type="dxa"/>
+              <w:bottom w:w="100" w:type="dxa"/>
+              <w:left w:w="140" w:type="dxa"/>
+              <w:right w:w="140" w:type="dxa"/>
+            </w:tcMar>
+          </w:tcPr>
+          <w:p>
+            <w:pPr>
+              <w:jc w:val="left"/>
+            </w:pPr>
+            <w:r>
+              <w:rPr>
+                <w:rFonts w:ascii="Times New Roman" w:hAnsi="Times New Roman"/>
+                <w:color w:val="1E293B"/>
+                <w:sz w:val="20"/>
+              </w:rPr>
+              <w:t>RevenueReport</w:t>
+            </w:r>
+          </w:p>
+        </w:tc>
+        <w:tc>
+          <w:tcPr>
+            <w:tcW w:type="dxa" w:w="1584"/>
+            <w:shd w:fill="F8FAFC"/>
+            <w:tcMar>
+              <w:top w:w="100" w:type="dxa"/>
+              <w:bottom w:w="100" w:type="dxa"/>
+              <w:left w:w="140" w:type="dxa"/>
+              <w:right w:w="140" w:type="dxa"/>
+            </w:tcMar>
+          </w:tcPr>
+          <w:p>
+            <w:pPr>
+              <w:jc w:val="left"/>
+            </w:pPr>
+            <w:r>
+              <w:rPr>
+                <w:rFonts w:ascii="Times New Roman" w:hAnsi="Times New Roman"/>
+                <w:color w:val="1E293B"/>
+                <w:sz w:val="20"/>
+              </w:rPr>
+              <w:t>double</w:t>
+            </w:r>
+          </w:p>
+        </w:tc>
+        <w:tc>
+          <w:tcPr>
+            <w:tcW w:type="dxa" w:w="3600"/>
+            <w:shd w:fill="F8FAFC"/>
+            <w:tcMar>
+              <w:top w:w="100" w:type="dxa"/>
+              <w:bottom w:w="100" w:type="dxa"/>
+              <w:left w:w="140" w:type="dxa"/>
+              <w:right w:w="140" w:type="dxa"/>
+            </w:tcMar>
+          </w:tcPr>
+          <w:p>
+            <w:pPr>
+              <w:jc w:val="left"/>
+            </w:pPr>
+            <w:r>
+              <w:rPr>
+                <w:rFonts w:ascii="Times New Roman" w:hAnsi="Times New Roman"/>
+                <w:color w:val="1E293B"/>
+                <w:sz w:val="20"/>
+              </w:rPr>
+              <w:t>Giá vé bình quân trên mỗi vé bán ra:</w:t>
+              <w:br/>
+              <w:t>AvgPrice = TotalSold &gt; 0 ? (GrossRevenue / TotalSold) : 0.0</w:t>
+            </w:r>
+          </w:p>
+        </w:tc>
+      </w:tr>
+      <w:tr>
+        <w:tc>
+          <w:tcPr>
+            <w:tcW w:type="dxa" w:w="2592"/>
+            <w:shd w:fill="FFFFFF"/>
+            <w:tcMar>
+              <w:top w:w="100" w:type="dxa"/>
+              <w:bottom w:w="100" w:type="dxa"/>
+              <w:left w:w="140" w:type="dxa"/>
+              <w:right w:w="140" w:type="dxa"/>
+            </w:tcMar>
+          </w:tcPr>
+          <w:p>
+            <w:pPr>
+              <w:jc w:val="center"/>
+            </w:pPr>
+            <w:r>
+              <w:rPr>
+                <w:rFonts w:ascii="Times New Roman" w:hAnsi="Times New Roman"/>
+                <w:color w:val="1E293B"/>
+                <w:sz w:val="20"/>
+              </w:rPr>
+              <w:t>calculateZoneContribution(zoneId)</w:t>
+            </w:r>
+          </w:p>
+        </w:tc>
+        <w:tc>
+          <w:tcPr>
+            <w:tcW w:type="dxa" w:w="1584"/>
+            <w:shd w:fill="FFFFFF"/>
+            <w:tcMar>
+              <w:top w:w="100" w:type="dxa"/>
+              <w:bottom w:w="100" w:type="dxa"/>
+              <w:left w:w="140" w:type="dxa"/>
+              <w:right w:w="140" w:type="dxa"/>
+            </w:tcMar>
+          </w:tcPr>
+          <w:p>
+            <w:pPr>
+              <w:jc w:val="left"/>
+            </w:pPr>
+            <w:r>
+              <w:rPr>
+                <w:rFonts w:ascii="Times New Roman" w:hAnsi="Times New Roman"/>
+                <w:color w:val="1E293B"/>
+                <w:sz w:val="20"/>
+              </w:rPr>
+              <w:t>RevenueReport</w:t>
+            </w:r>
+          </w:p>
+        </w:tc>
+        <w:tc>
+          <w:tcPr>
+            <w:tcW w:type="dxa" w:w="1584"/>
+            <w:shd w:fill="FFFFFF"/>
+            <w:tcMar>
+              <w:top w:w="100" w:type="dxa"/>
+              <w:bottom w:w="100" w:type="dxa"/>
+              <w:left w:w="140" w:type="dxa"/>
+              <w:right w:w="140" w:type="dxa"/>
+            </w:tcMar>
+          </w:tcPr>
+          <w:p>
+            <w:pPr>
+              <w:jc w:val="left"/>
+            </w:pPr>
+            <w:r>
+              <w:rPr>
+                <w:rFonts w:ascii="Times New Roman" w:hAnsi="Times New Roman"/>
+                <w:color w:val="1E293B"/>
+                <w:sz w:val="20"/>
+              </w:rPr>
+              <w:t>double</w:t>
+            </w:r>
+          </w:p>
+        </w:tc>
+        <w:tc>
+          <w:tcPr>
+            <w:tcW w:type="dxa" w:w="3600"/>
+            <w:shd w:fill="FFFFFF"/>
+            <w:tcMar>
+              <w:top w:w="100" w:type="dxa"/>
+              <w:bottom w:w="100" w:type="dxa"/>
+              <w:left w:w="140" w:type="dxa"/>
+              <w:right w:w="140" w:type="dxa"/>
+            </w:tcMar>
+          </w:tcPr>
+          <w:p>
+            <w:pPr>
+              <w:jc w:val="left"/>
+            </w:pPr>
+            <w:r>
+              <w:rPr>
+                <w:rFonts w:ascii="Times New Roman" w:hAnsi="Times New Roman"/>
+                <w:color w:val="1E293B"/>
+                <w:sz w:val="20"/>
+              </w:rPr>
+              <w:t>Tỷ trọng đóng góp doanh thu của một khu vực so với tổng doanh thu:</w:t>
+              <w:br/>
+              <w:t>Contribution = (ZoneGross / GrossRevenue) * 100.0%</w:t>
+            </w:r>
+          </w:p>
+        </w:tc>
+      </w:tr>
+      <w:tr>
+        <w:tc>
+          <w:tcPr>
+            <w:tcW w:type="dxa" w:w="2592"/>
+            <w:shd w:fill="F8FAFC"/>
+            <w:tcMar>
+              <w:top w:w="100" w:type="dxa"/>
+              <w:bottom w:w="100" w:type="dxa"/>
+              <w:left w:w="140" w:type="dxa"/>
+              <w:right w:w="140" w:type="dxa"/>
+            </w:tcMar>
+          </w:tcPr>
+          <w:p>
+            <w:pPr>
+              <w:jc w:val="center"/>
+            </w:pPr>
+            <w:r>
+              <w:rPr>
+                <w:rFonts w:ascii="Times New Roman" w:hAnsi="Times New Roman"/>
+                <w:color w:val="1E293B"/>
+                <w:sz w:val="20"/>
+              </w:rPr>
+              <w:t>evaluatePerformance()</w:t>
+            </w:r>
+          </w:p>
+        </w:tc>
+        <w:tc>
+          <w:tcPr>
+            <w:tcW w:type="dxa" w:w="1584"/>
+            <w:shd w:fill="F8FAFC"/>
+            <w:tcMar>
+              <w:top w:w="100" w:type="dxa"/>
+              <w:bottom w:w="100" w:type="dxa"/>
+              <w:left w:w="140" w:type="dxa"/>
+              <w:right w:w="140" w:type="dxa"/>
+            </w:tcMar>
+          </w:tcPr>
+          <w:p>
+            <w:pPr>
+              <w:jc w:val="left"/>
+            </w:pPr>
+            <w:r>
+              <w:rPr>
+                <w:rFonts w:ascii="Times New Roman" w:hAnsi="Times New Roman"/>
+                <w:color w:val="1E293B"/>
+                <w:sz w:val="20"/>
+              </w:rPr>
+              <w:t>RevenueReport</w:t>
+            </w:r>
+          </w:p>
+        </w:tc>
+        <w:tc>
+          <w:tcPr>
+            <w:tcW w:type="dxa" w:w="1584"/>
+            <w:shd w:fill="F8FAFC"/>
+            <w:tcMar>
+              <w:top w:w="100" w:type="dxa"/>
+              <w:bottom w:w="100" w:type="dxa"/>
+              <w:left w:w="140" w:type="dxa"/>
+              <w:right w:w="140" w:type="dxa"/>
+            </w:tcMar>
+          </w:tcPr>
+          <w:p>
+            <w:pPr>
+              <w:jc w:val="left"/>
+            </w:pPr>
+            <w:r>
+              <w:rPr>
+                <w:rFonts w:ascii="Times New Roman" w:hAnsi="Times New Roman"/>
+                <w:color w:val="1E293B"/>
+                <w:sz w:val="20"/>
+              </w:rPr>
+              <w:t>PerformanceStatus</w:t>
+            </w:r>
+          </w:p>
+        </w:tc>
+        <w:tc>
+          <w:tcPr>
+            <w:tcW w:type="dxa" w:w="3600"/>
+            <w:shd w:fill="F8FAFC"/>
+            <w:tcMar>
+              <w:top w:w="100" w:type="dxa"/>
+              <w:bottom w:w="100" w:type="dxa"/>
+              <w:left w:w="140" w:type="dxa"/>
+              <w:right w:w="140" w:type="dxa"/>
+            </w:tcMar>
+          </w:tcPr>
+          <w:p>
+            <w:pPr>
+              <w:jc w:val="left"/>
+            </w:pPr>
+            <w:r>
+              <w:rPr>
+                <w:rFonts w:ascii="Times New Roman" w:hAnsi="Times New Roman"/>
+                <w:color w:val="1E293B"/>
+                <w:sz w:val="20"/>
+              </w:rPr>
+              <w:t>Đánh giá phân loại sức mua theo thang tỷ lệ lấp đầy:</w:t>
+              <w:br/>
+              <w:t>- Occupancy &gt;= 85%: EXCELLENT (Cháy vé)</w:t>
+              <w:br/>
+              <w:t>- 70% &lt;= Occupancy &lt; 85%: GOOD (Đạt chỉ tiêu)</w:t>
+              <w:br/>
+              <w:t>- 50% &lt;= Occupancy &lt; 70%: AVERAGE (Hòa vốn)</w:t>
+              <w:br/>
+              <w:t>- Occupancy &lt; 50%: POOR (Cần giải cứu vé)</w:t>
+            </w:r>
+          </w:p>
+        </w:tc>
+      </w:tr>
+      <w:tr>
+        <w:tc>
+          <w:tcPr>
+            <w:tcW w:type="dxa" w:w="2592"/>
+            <w:shd w:fill="FFFFFF"/>
+            <w:tcMar>
+              <w:top w:w="100" w:type="dxa"/>
+              <w:bottom w:w="100" w:type="dxa"/>
+              <w:left w:w="140" w:type="dxa"/>
+              <w:right w:w="140" w:type="dxa"/>
+            </w:tcMar>
+          </w:tcPr>
+          <w:p>
+            <w:pPr>
+              <w:jc w:val="center"/>
+            </w:pPr>
+            <w:r>
+              <w:rPr>
+                <w:rFonts w:ascii="Times New Roman" w:hAnsi="Times New Roman"/>
+                <w:color w:val="1E293B"/>
+                <w:sz w:val="20"/>
+              </w:rPr>
+              <w:t>calculateZoneGross()</w:t>
+            </w:r>
+          </w:p>
+        </w:tc>
+        <w:tc>
+          <w:tcPr>
+            <w:tcW w:type="dxa" w:w="1584"/>
+            <w:shd w:fill="FFFFFF"/>
+            <w:tcMar>
+              <w:top w:w="100" w:type="dxa"/>
+              <w:bottom w:w="100" w:type="dxa"/>
+              <w:left w:w="140" w:type="dxa"/>
+              <w:right w:w="140" w:type="dxa"/>
+            </w:tcMar>
+          </w:tcPr>
+          <w:p>
+            <w:pPr>
+              <w:jc w:val="left"/>
+            </w:pPr>
+            <w:r>
+              <w:rPr>
+                <w:rFonts w:ascii="Times New Roman" w:hAnsi="Times New Roman"/>
+                <w:color w:val="1E293B"/>
+                <w:sz w:val="20"/>
+              </w:rPr>
+              <w:t>ZonePricing</w:t>
+            </w:r>
+          </w:p>
+        </w:tc>
+        <w:tc>
+          <w:tcPr>
+            <w:tcW w:type="dxa" w:w="1584"/>
+            <w:shd w:fill="FFFFFF"/>
+            <w:tcMar>
+              <w:top w:w="100" w:type="dxa"/>
+              <w:bottom w:w="100" w:type="dxa"/>
+              <w:left w:w="140" w:type="dxa"/>
+              <w:right w:w="140" w:type="dxa"/>
+            </w:tcMar>
+          </w:tcPr>
+          <w:p>
+            <w:pPr>
+              <w:jc w:val="left"/>
+            </w:pPr>
+            <w:r>
+              <w:rPr>
+                <w:rFonts w:ascii="Times New Roman" w:hAnsi="Times New Roman"/>
+                <w:color w:val="1E293B"/>
+                <w:sz w:val="20"/>
+              </w:rPr>
+              <w:t>double</w:t>
+            </w:r>
+          </w:p>
+        </w:tc>
+        <w:tc>
+          <w:tcPr>
+            <w:tcW w:type="dxa" w:w="3600"/>
+            <w:shd w:fill="FFFFFF"/>
+            <w:tcMar>
+              <w:top w:w="100" w:type="dxa"/>
+              <w:bottom w:w="100" w:type="dxa"/>
+              <w:left w:w="140" w:type="dxa"/>
+              <w:right w:w="140" w:type="dxa"/>
+            </w:tcMar>
+          </w:tcPr>
+          <w:p>
+            <w:pPr>
+              <w:jc w:val="left"/>
+            </w:pPr>
+            <w:r>
+              <w:rPr>
+                <w:rFonts w:ascii="Times New Roman" w:hAnsi="Times New Roman"/>
+                <w:color w:val="1E293B"/>
+                <w:sz w:val="20"/>
+              </w:rPr>
+              <w:t>Doanh thu của riêng phân khu vé = price * soldCount</w:t>
+            </w:r>
+          </w:p>
+        </w:tc>
+      </w:tr>
+      <w:tr>
+        <w:tc>
+          <w:tcPr>
+            <w:tcW w:type="dxa" w:w="2592"/>
+            <w:shd w:fill="F8FAFC"/>
+            <w:tcMar>
+              <w:top w:w="100" w:type="dxa"/>
+              <w:bottom w:w="100" w:type="dxa"/>
+              <w:left w:w="140" w:type="dxa"/>
+              <w:right w:w="140" w:type="dxa"/>
+            </w:tcMar>
+          </w:tcPr>
+          <w:p>
+            <w:pPr>
+              <w:jc w:val="center"/>
+            </w:pPr>
+            <w:r>
+              <w:rPr>
+                <w:rFonts w:ascii="Times New Roman" w:hAnsi="Times New Roman"/>
+                <w:color w:val="1E293B"/>
+                <w:sz w:val="20"/>
+              </w:rPr>
+              <w:t>getSoldRate()</w:t>
+            </w:r>
+          </w:p>
+        </w:tc>
+        <w:tc>
+          <w:tcPr>
+            <w:tcW w:type="dxa" w:w="1584"/>
+            <w:shd w:fill="F8FAFC"/>
+            <w:tcMar>
+              <w:top w:w="100" w:type="dxa"/>
+              <w:bottom w:w="100" w:type="dxa"/>
+              <w:left w:w="140" w:type="dxa"/>
+              <w:right w:w="140" w:type="dxa"/>
+            </w:tcMar>
+          </w:tcPr>
+          <w:p>
+            <w:pPr>
+              <w:jc w:val="left"/>
+            </w:pPr>
+            <w:r>
+              <w:rPr>
+                <w:rFonts w:ascii="Times New Roman" w:hAnsi="Times New Roman"/>
+                <w:color w:val="1E293B"/>
+                <w:sz w:val="20"/>
+              </w:rPr>
+              <w:t>ZonePricing</w:t>
+            </w:r>
+          </w:p>
+        </w:tc>
+        <w:tc>
+          <w:tcPr>
+            <w:tcW w:type="dxa" w:w="1584"/>
+            <w:shd w:fill="F8FAFC"/>
+            <w:tcMar>
+              <w:top w:w="100" w:type="dxa"/>
+              <w:bottom w:w="100" w:type="dxa"/>
+              <w:left w:w="140" w:type="dxa"/>
+              <w:right w:w="140" w:type="dxa"/>
+            </w:tcMar>
+          </w:tcPr>
+          <w:p>
+            <w:pPr>
+              <w:jc w:val="left"/>
+            </w:pPr>
+            <w:r>
+              <w:rPr>
+                <w:rFonts w:ascii="Times New Roman" w:hAnsi="Times New Roman"/>
+                <w:color w:val="1E293B"/>
+                <w:sz w:val="20"/>
+              </w:rPr>
+              <w:t>double</w:t>
+            </w:r>
+          </w:p>
+        </w:tc>
+        <w:tc>
+          <w:tcPr>
+            <w:tcW w:type="dxa" w:w="3600"/>
+            <w:shd w:fill="F8FAFC"/>
+            <w:tcMar>
+              <w:top w:w="100" w:type="dxa"/>
+              <w:bottom w:w="100" w:type="dxa"/>
+              <w:left w:w="140" w:type="dxa"/>
+              <w:right w:w="140" w:type="dxa"/>
+            </w:tcMar>
+          </w:tcPr>
+          <w:p>
+            <w:pPr>
+              <w:jc w:val="left"/>
+            </w:pPr>
+            <w:r>
+              <w:rPr>
+                <w:rFonts w:ascii="Times New Roman" w:hAnsi="Times New Roman"/>
+                <w:color w:val="1E293B"/>
+                <w:sz w:val="20"/>
+              </w:rPr>
+              <w:t>Tỷ lệ bán của riêng phân khu = (soldCount / (double) maxQuota) * 100.0%</w:t>
             </w:r>
           </w:p>
         </w:tc>

</xml_diff>

<commit_message>
Add detailed analysis class diagram for Module 5
</commit_message>
<xml_diff>
--- a/N12 Nhóm 01.docx
+++ b/N12 Nhóm 01.docx
@@ -7636,6 +7636,92 @@
     <w:p>
       <w:pPr>
         <w:keepNext/>
+        <w:spacing w:before="160" w:after="60"/>
+      </w:pPr>
+      <w:r>
+        <w:rPr>
+          <w:rFonts w:ascii="Times New Roman" w:hAnsi="Times New Roman"/>
+          <w:b/>
+          <w:i/>
+          <w:color w:val="334155"/>
+          <w:sz w:val="23"/>
+        </w:rPr>
+        <w:t>3.6.1. Biểu đồ lớp phân tích chi tiết cho chức năng Xem thống kê doanh thu sự kiện</w:t>
+      </w:r>
+    </w:p>
+    <w:p>
+      <w:pPr>
+        <w:spacing w:before="0" w:after="100" w:line="300" w:lineRule="auto"/>
+      </w:pPr>
+      <w:r>
+        <w:rPr>
+          <w:rFonts w:ascii="Times New Roman" w:hAnsi="Times New Roman"/>
+          <w:color w:val="1E293B"/>
+          <w:sz w:val="23"/>
+        </w:rPr>
+        <w:t>Để đáp ứng nguyên tắc hướng đối tượng cốt lõi (Lớp phải đóng gói trạng thái và hành vi tính toán nghiệp vụ, không chỉ là tập hợp dữ liệu thụ động/Anemic Domain Model), biểu đồ lớp phân tích dưới đây thể hiện chi tiết các thực thể tham gia ca sử dụng đơn lẻ 'Xem thống kê doanh thu sự kiện' cùng các phương thức tính toán tài chính trọng tâm:</w:t>
+      </w:r>
+    </w:p>
+    <w:p>
+      <w:pPr>
+        <w:keepNext/>
+        <w:spacing w:before="160" w:after="40"/>
+        <w:jc w:val="center"/>
+      </w:pPr>
+      <w:r>
+        <w:drawing>
+          <wp:inline xmlns:a="http://schemas.openxmlformats.org/drawingml/2006/main" xmlns:pic="http://schemas.openxmlformats.org/drawingml/2006/picture">
+            <wp:extent cx="5669280" cy="3833301"/>
+            <wp:docPr id="13" name="Picture 13"/>
+            <wp:cNvGraphicFramePr>
+              <a:graphicFrameLocks noChangeAspect="1"/>
+            </wp:cNvGraphicFramePr>
+            <a:graphic>
+              <a:graphicData uri="http://schemas.openxmlformats.org/drawingml/2006/picture">
+                <pic:pic>
+                  <pic:nvPicPr>
+                    <pic:cNvPr id="0" name="analysis_m5_view_revenue_detail.png"/>
+                    <pic:cNvPicPr/>
+                  </pic:nvPicPr>
+                  <pic:blipFill>
+                    <a:blip r:embed="rId21"/>
+                    <a:stretch>
+                      <a:fillRect/>
+                    </a:stretch>
+                  </pic:blipFill>
+                  <pic:spPr>
+                    <a:xfrm>
+                      <a:off x="0" y="0"/>
+                      <a:ext cx="5669280" cy="3833301"/>
+                    </a:xfrm>
+                    <a:prstGeom prst="rect"/>
+                  </pic:spPr>
+                </pic:pic>
+              </a:graphicData>
+            </a:graphic>
+          </wp:inline>
+        </w:drawing>
+      </w:r>
+    </w:p>
+    <w:p>
+      <w:pPr>
+        <w:spacing w:before="40" w:after="200"/>
+        <w:jc w:val="center"/>
+      </w:pPr>
+      <w:r>
+        <w:rPr>
+          <w:rFonts w:ascii="Times New Roman" w:hAnsi="Times New Roman"/>
+          <w:b/>
+          <w:i/>
+          <w:color w:val="475569"/>
+          <w:sz w:val="20"/>
+        </w:rPr>
+        <w:t>Hình 3.7: Biểu đồ lớp phân tích chi tiết - Chức năng Xem thống kê doanh thu sự kiện</w:t>
+      </w:r>
+    </w:p>
+    <w:p>
+      <w:pPr>
+        <w:keepNext/>
         <w:spacing w:before="320" w:after="120"/>
       </w:pPr>
       <w:r>
@@ -7800,7 +7886,7 @@
         <w:drawing>
           <wp:inline xmlns:a="http://schemas.openxmlformats.org/drawingml/2006/main" xmlns:pic="http://schemas.openxmlformats.org/drawingml/2006/picture">
             <wp:extent cx="5669280" cy="4243151"/>
-            <wp:docPr id="13" name="Picture 13"/>
+            <wp:docPr id="14" name="Picture 14"/>
             <wp:cNvGraphicFramePr>
               <a:graphicFrameLocks noChangeAspect="1"/>
             </wp:cNvGraphicFramePr>
@@ -7812,7 +7898,7 @@
                     <pic:cNvPicPr/>
                   </pic:nvPicPr>
                   <pic:blipFill>
-                    <a:blip r:embed="rId21"/>
+                    <a:blip r:embed="rId22"/>
                     <a:stretch>
                       <a:fillRect/>
                     </a:stretch>
@@ -7885,7 +7971,7 @@
         <w:drawing>
           <wp:inline xmlns:a="http://schemas.openxmlformats.org/drawingml/2006/main" xmlns:pic="http://schemas.openxmlformats.org/drawingml/2006/picture">
             <wp:extent cx="5669280" cy="4108277"/>
-            <wp:docPr id="14" name="Picture 14"/>
+            <wp:docPr id="15" name="Picture 15"/>
             <wp:cNvGraphicFramePr>
               <a:graphicFrameLocks noChangeAspect="1"/>
             </wp:cNvGraphicFramePr>
@@ -7897,7 +7983,7 @@
                     <pic:cNvPicPr/>
                   </pic:nvPicPr>
                   <pic:blipFill>
-                    <a:blip r:embed="rId22"/>
+                    <a:blip r:embed="rId23"/>
                     <a:stretch>
                       <a:fillRect/>
                     </a:stretch>
@@ -8516,7 +8602,7 @@
         <w:drawing>
           <wp:inline xmlns:a="http://schemas.openxmlformats.org/drawingml/2006/main" xmlns:pic="http://schemas.openxmlformats.org/drawingml/2006/picture">
             <wp:extent cx="5669280" cy="4033196"/>
-            <wp:docPr id="15" name="Picture 15"/>
+            <wp:docPr id="16" name="Picture 16"/>
             <wp:cNvGraphicFramePr>
               <a:graphicFrameLocks noChangeAspect="1"/>
             </wp:cNvGraphicFramePr>
@@ -8528,7 +8614,7 @@
                     <pic:cNvPicPr/>
                   </pic:nvPicPr>
                   <pic:blipFill>
-                    <a:blip r:embed="rId23"/>
+                    <a:blip r:embed="rId24"/>
                     <a:stretch>
                       <a:fillRect/>
                     </a:stretch>
@@ -9218,7 +9304,7 @@
         <w:drawing>
           <wp:inline xmlns:a="http://schemas.openxmlformats.org/drawingml/2006/main" xmlns:pic="http://schemas.openxmlformats.org/drawingml/2006/picture">
             <wp:extent cx="5669280" cy="4033196"/>
-            <wp:docPr id="16" name="Picture 16"/>
+            <wp:docPr id="17" name="Picture 17"/>
             <wp:cNvGraphicFramePr>
               <a:graphicFrameLocks noChangeAspect="1"/>
             </wp:cNvGraphicFramePr>
@@ -9230,7 +9316,7 @@
                     <pic:cNvPicPr/>
                   </pic:nvPicPr>
                   <pic:blipFill>
-                    <a:blip r:embed="rId24"/>
+                    <a:blip r:embed="rId25"/>
                     <a:stretch>
                       <a:fillRect/>
                     </a:stretch>
@@ -9847,7 +9933,7 @@
         <w:drawing>
           <wp:inline xmlns:a="http://schemas.openxmlformats.org/drawingml/2006/main" xmlns:pic="http://schemas.openxmlformats.org/drawingml/2006/picture">
             <wp:extent cx="5669280" cy="4033196"/>
-            <wp:docPr id="17" name="Picture 17"/>
+            <wp:docPr id="18" name="Picture 18"/>
             <wp:cNvGraphicFramePr>
               <a:graphicFrameLocks noChangeAspect="1"/>
             </wp:cNvGraphicFramePr>
@@ -9859,7 +9945,7 @@
                     <pic:cNvPicPr/>
                   </pic:nvPicPr>
                   <pic:blipFill>
-                    <a:blip r:embed="rId25"/>
+                    <a:blip r:embed="rId26"/>
                     <a:stretch>
                       <a:fillRect/>
                     </a:stretch>
@@ -10401,7 +10487,7 @@
         <w:drawing>
           <wp:inline xmlns:a="http://schemas.openxmlformats.org/drawingml/2006/main" xmlns:pic="http://schemas.openxmlformats.org/drawingml/2006/picture">
             <wp:extent cx="5669280" cy="4033196"/>
-            <wp:docPr id="18" name="Picture 18"/>
+            <wp:docPr id="19" name="Picture 19"/>
             <wp:cNvGraphicFramePr>
               <a:graphicFrameLocks noChangeAspect="1"/>
             </wp:cNvGraphicFramePr>
@@ -10413,7 +10499,7 @@
                     <pic:cNvPicPr/>
                   </pic:nvPicPr>
                   <pic:blipFill>
-                    <a:blip r:embed="rId26"/>
+                    <a:blip r:embed="rId27"/>
                     <a:stretch>
                       <a:fillRect/>
                     </a:stretch>
@@ -11380,7 +11466,7 @@
         <w:drawing>
           <wp:inline xmlns:a="http://schemas.openxmlformats.org/drawingml/2006/main" xmlns:pic="http://schemas.openxmlformats.org/drawingml/2006/picture">
             <wp:extent cx="5669280" cy="3764771"/>
-            <wp:docPr id="19" name="Picture 19"/>
+            <wp:docPr id="20" name="Picture 20"/>
             <wp:cNvGraphicFramePr>
               <a:graphicFrameLocks noChangeAspect="1"/>
             </wp:cNvGraphicFramePr>
@@ -11392,7 +11478,7 @@
                     <pic:cNvPicPr/>
                   </pic:nvPicPr>
                   <pic:blipFill>
-                    <a:blip r:embed="rId27"/>
+                    <a:blip r:embed="rId28"/>
                     <a:stretch>
                       <a:fillRect/>
                     </a:stretch>
@@ -11466,7 +11552,7 @@
         <w:drawing>
           <wp:inline xmlns:a="http://schemas.openxmlformats.org/drawingml/2006/main" xmlns:pic="http://schemas.openxmlformats.org/drawingml/2006/picture">
             <wp:extent cx="5669280" cy="3700158"/>
-            <wp:docPr id="20" name="Picture 20"/>
+            <wp:docPr id="21" name="Picture 21"/>
             <wp:cNvGraphicFramePr>
               <a:graphicFrameLocks noChangeAspect="1"/>
             </wp:cNvGraphicFramePr>
@@ -11478,7 +11564,7 @@
                     <pic:cNvPicPr/>
                   </pic:nvPicPr>
                   <pic:blipFill>
-                    <a:blip r:embed="rId28"/>
+                    <a:blip r:embed="rId29"/>
                     <a:stretch>
                       <a:fillRect/>
                     </a:stretch>

</xml_diff>

<commit_message>
Add detailed use case diagram for Module 5
</commit_message>
<xml_diff>
--- a/N12 Nhóm 01.docx
+++ b/N12 Nhóm 01.docx
@@ -5683,6 +5683,92 @@
     <w:p>
       <w:pPr>
         <w:keepNext/>
+        <w:spacing w:before="160" w:after="60"/>
+      </w:pPr>
+      <w:r>
+        <w:rPr>
+          <w:rFonts w:ascii="Times New Roman" w:hAnsi="Times New Roman"/>
+          <w:b/>
+          <w:i/>
+          <w:color w:val="334155"/>
+          <w:sz w:val="23"/>
+        </w:rPr>
+        <w:t>2.6.1. Biểu đồ Use Case chi tiết cho chức năng Xem thống kê doanh thu sự kiện</w:t>
+      </w:r>
+    </w:p>
+    <w:p>
+      <w:pPr>
+        <w:spacing w:before="0" w:after="100" w:line="300" w:lineRule="auto"/>
+      </w:pPr>
+      <w:r>
+        <w:rPr>
+          <w:rFonts w:ascii="Times New Roman" w:hAnsi="Times New Roman"/>
+          <w:color w:val="1E293B"/>
+          <w:sz w:val="23"/>
+        </w:rPr>
+        <w:t>Biểu đồ Use Case phân rã chi tiết cho ca sử dụng trọng tâm 'Xem thống kê doanh thu sự kiện' làm rõ các ca sử dụng bắt buộc bao hàm (&lt;&lt;include&gt;&gt;) để thực hiện tính toán tài chính và các ca sử dụng mở rộng (&lt;&lt;extend&gt;&gt;) phục vụ lọc và kết xuất báo cáo:</w:t>
+      </w:r>
+    </w:p>
+    <w:p>
+      <w:pPr>
+        <w:keepNext/>
+        <w:spacing w:before="160" w:after="40"/>
+        <w:jc w:val="center"/>
+      </w:pPr>
+      <w:r>
+        <w:drawing>
+          <wp:inline xmlns:a="http://schemas.openxmlformats.org/drawingml/2006/main" xmlns:pic="http://schemas.openxmlformats.org/drawingml/2006/picture">
+            <wp:extent cx="5669280" cy="4001207"/>
+            <wp:docPr id="7" name="Picture 7"/>
+            <wp:cNvGraphicFramePr>
+              <a:graphicFrameLocks noChangeAspect="1"/>
+            </wp:cNvGraphicFramePr>
+            <a:graphic>
+              <a:graphicData uri="http://schemas.openxmlformats.org/drawingml/2006/picture">
+                <pic:pic>
+                  <pic:nvPicPr>
+                    <pic:cNvPr id="0" name="uc_m5_view_revenue_detail.png"/>
+                    <pic:cNvPicPr/>
+                  </pic:nvPicPr>
+                  <pic:blipFill>
+                    <a:blip r:embed="rId15"/>
+                    <a:stretch>
+                      <a:fillRect/>
+                    </a:stretch>
+                  </pic:blipFill>
+                  <pic:spPr>
+                    <a:xfrm>
+                      <a:off x="0" y="0"/>
+                      <a:ext cx="5669280" cy="4001207"/>
+                    </a:xfrm>
+                    <a:prstGeom prst="rect"/>
+                  </pic:spPr>
+                </pic:pic>
+              </a:graphicData>
+            </a:graphic>
+          </wp:inline>
+        </w:drawing>
+      </w:r>
+    </w:p>
+    <w:p>
+      <w:pPr>
+        <w:spacing w:before="40" w:after="200"/>
+        <w:jc w:val="center"/>
+      </w:pPr>
+      <w:r>
+        <w:rPr>
+          <w:rFonts w:ascii="Times New Roman" w:hAnsi="Times New Roman"/>
+          <w:b/>
+          <w:i/>
+          <w:color w:val="475569"/>
+          <w:sz w:val="20"/>
+        </w:rPr>
+        <w:t>Hình 2.7: Biểu đồ Use Case chi tiết - Chức năng Xem thống kê doanh thu sự kiện</w:t>
+      </w:r>
+    </w:p>
+    <w:p>
+      <w:pPr>
+        <w:keepNext/>
         <w:spacing w:before="320" w:after="120"/>
       </w:pPr>
       <w:r>
@@ -5824,7 +5910,7 @@
         <w:drawing>
           <wp:inline xmlns:a="http://schemas.openxmlformats.org/drawingml/2006/main" xmlns:pic="http://schemas.openxmlformats.org/drawingml/2006/picture">
             <wp:extent cx="5669280" cy="4130561"/>
-            <wp:docPr id="7" name="Picture 7"/>
+            <wp:docPr id="8" name="Picture 8"/>
             <wp:cNvGraphicFramePr>
               <a:graphicFrameLocks noChangeAspect="1"/>
             </wp:cNvGraphicFramePr>
@@ -5836,7 +5922,7 @@
                     <pic:cNvPicPr/>
                   </pic:nvPicPr>
                   <pic:blipFill>
-                    <a:blip r:embed="rId15"/>
+                    <a:blip r:embed="rId16"/>
                     <a:stretch>
                       <a:fillRect/>
                     </a:stretch>
@@ -7246,7 +7332,7 @@
         <w:drawing>
           <wp:inline xmlns:a="http://schemas.openxmlformats.org/drawingml/2006/main" xmlns:pic="http://schemas.openxmlformats.org/drawingml/2006/picture">
             <wp:extent cx="5669280" cy="4033196"/>
-            <wp:docPr id="8" name="Picture 8"/>
+            <wp:docPr id="9" name="Picture 9"/>
             <wp:cNvGraphicFramePr>
               <a:graphicFrameLocks noChangeAspect="1"/>
             </wp:cNvGraphicFramePr>
@@ -7258,7 +7344,7 @@
                     <pic:cNvPicPr/>
                   </pic:nvPicPr>
                   <pic:blipFill>
-                    <a:blip r:embed="rId16"/>
+                    <a:blip r:embed="rId17"/>
                     <a:stretch>
                       <a:fillRect/>
                     </a:stretch>
@@ -7331,7 +7417,7 @@
         <w:drawing>
           <wp:inline xmlns:a="http://schemas.openxmlformats.org/drawingml/2006/main" xmlns:pic="http://schemas.openxmlformats.org/drawingml/2006/picture">
             <wp:extent cx="5669280" cy="4067715"/>
-            <wp:docPr id="9" name="Picture 9"/>
+            <wp:docPr id="10" name="Picture 10"/>
             <wp:cNvGraphicFramePr>
               <a:graphicFrameLocks noChangeAspect="1"/>
             </wp:cNvGraphicFramePr>
@@ -7343,7 +7429,7 @@
                     <pic:cNvPicPr/>
                   </pic:nvPicPr>
                   <pic:blipFill>
-                    <a:blip r:embed="rId17"/>
+                    <a:blip r:embed="rId18"/>
                     <a:stretch>
                       <a:fillRect/>
                     </a:stretch>
@@ -7416,7 +7502,7 @@
         <w:drawing>
           <wp:inline xmlns:a="http://schemas.openxmlformats.org/drawingml/2006/main" xmlns:pic="http://schemas.openxmlformats.org/drawingml/2006/picture">
             <wp:extent cx="5669280" cy="4033196"/>
-            <wp:docPr id="10" name="Picture 10"/>
+            <wp:docPr id="11" name="Picture 11"/>
             <wp:cNvGraphicFramePr>
               <a:graphicFrameLocks noChangeAspect="1"/>
             </wp:cNvGraphicFramePr>
@@ -7428,7 +7514,7 @@
                     <pic:cNvPicPr/>
                   </pic:nvPicPr>
                   <pic:blipFill>
-                    <a:blip r:embed="rId18"/>
+                    <a:blip r:embed="rId19"/>
                     <a:stretch>
                       <a:fillRect/>
                     </a:stretch>
@@ -7501,7 +7587,7 @@
         <w:drawing>
           <wp:inline xmlns:a="http://schemas.openxmlformats.org/drawingml/2006/main" xmlns:pic="http://schemas.openxmlformats.org/drawingml/2006/picture">
             <wp:extent cx="5669280" cy="4067715"/>
-            <wp:docPr id="11" name="Picture 11"/>
+            <wp:docPr id="12" name="Picture 12"/>
             <wp:cNvGraphicFramePr>
               <a:graphicFrameLocks noChangeAspect="1"/>
             </wp:cNvGraphicFramePr>
@@ -7513,7 +7599,7 @@
                     <pic:cNvPicPr/>
                   </pic:nvPicPr>
                   <pic:blipFill>
-                    <a:blip r:embed="rId19"/>
+                    <a:blip r:embed="rId20"/>
                     <a:stretch>
                       <a:fillRect/>
                     </a:stretch>
@@ -7586,7 +7672,7 @@
         <w:drawing>
           <wp:inline xmlns:a="http://schemas.openxmlformats.org/drawingml/2006/main" xmlns:pic="http://schemas.openxmlformats.org/drawingml/2006/picture">
             <wp:extent cx="5669280" cy="4067715"/>
-            <wp:docPr id="12" name="Picture 12"/>
+            <wp:docPr id="13" name="Picture 13"/>
             <wp:cNvGraphicFramePr>
               <a:graphicFrameLocks noChangeAspect="1"/>
             </wp:cNvGraphicFramePr>
@@ -7598,7 +7684,7 @@
                     <pic:cNvPicPr/>
                   </pic:nvPicPr>
                   <pic:blipFill>
-                    <a:blip r:embed="rId20"/>
+                    <a:blip r:embed="rId21"/>
                     <a:stretch>
                       <a:fillRect/>
                     </a:stretch>
@@ -7672,7 +7758,7 @@
         <w:drawing>
           <wp:inline xmlns:a="http://schemas.openxmlformats.org/drawingml/2006/main" xmlns:pic="http://schemas.openxmlformats.org/drawingml/2006/picture">
             <wp:extent cx="5669280" cy="3833301"/>
-            <wp:docPr id="13" name="Picture 13"/>
+            <wp:docPr id="14" name="Picture 14"/>
             <wp:cNvGraphicFramePr>
               <a:graphicFrameLocks noChangeAspect="1"/>
             </wp:cNvGraphicFramePr>
@@ -7684,7 +7770,7 @@
                     <pic:cNvPicPr/>
                   </pic:nvPicPr>
                   <pic:blipFill>
-                    <a:blip r:embed="rId21"/>
+                    <a:blip r:embed="rId22"/>
                     <a:stretch>
                       <a:fillRect/>
                     </a:stretch>
@@ -7886,7 +7972,7 @@
         <w:drawing>
           <wp:inline xmlns:a="http://schemas.openxmlformats.org/drawingml/2006/main" xmlns:pic="http://schemas.openxmlformats.org/drawingml/2006/picture">
             <wp:extent cx="5669280" cy="4243151"/>
-            <wp:docPr id="14" name="Picture 14"/>
+            <wp:docPr id="15" name="Picture 15"/>
             <wp:cNvGraphicFramePr>
               <a:graphicFrameLocks noChangeAspect="1"/>
             </wp:cNvGraphicFramePr>
@@ -7898,7 +7984,7 @@
                     <pic:cNvPicPr/>
                   </pic:nvPicPr>
                   <pic:blipFill>
-                    <a:blip r:embed="rId22"/>
+                    <a:blip r:embed="rId23"/>
                     <a:stretch>
                       <a:fillRect/>
                     </a:stretch>
@@ -7971,7 +8057,7 @@
         <w:drawing>
           <wp:inline xmlns:a="http://schemas.openxmlformats.org/drawingml/2006/main" xmlns:pic="http://schemas.openxmlformats.org/drawingml/2006/picture">
             <wp:extent cx="5669280" cy="4108277"/>
-            <wp:docPr id="15" name="Picture 15"/>
+            <wp:docPr id="16" name="Picture 16"/>
             <wp:cNvGraphicFramePr>
               <a:graphicFrameLocks noChangeAspect="1"/>
             </wp:cNvGraphicFramePr>
@@ -7983,7 +8069,7 @@
                     <pic:cNvPicPr/>
                   </pic:nvPicPr>
                   <pic:blipFill>
-                    <a:blip r:embed="rId23"/>
+                    <a:blip r:embed="rId24"/>
                     <a:stretch>
                       <a:fillRect/>
                     </a:stretch>
@@ -8602,7 +8688,7 @@
         <w:drawing>
           <wp:inline xmlns:a="http://schemas.openxmlformats.org/drawingml/2006/main" xmlns:pic="http://schemas.openxmlformats.org/drawingml/2006/picture">
             <wp:extent cx="5669280" cy="4033196"/>
-            <wp:docPr id="16" name="Picture 16"/>
+            <wp:docPr id="17" name="Picture 17"/>
             <wp:cNvGraphicFramePr>
               <a:graphicFrameLocks noChangeAspect="1"/>
             </wp:cNvGraphicFramePr>
@@ -8614,7 +8700,7 @@
                     <pic:cNvPicPr/>
                   </pic:nvPicPr>
                   <pic:blipFill>
-                    <a:blip r:embed="rId24"/>
+                    <a:blip r:embed="rId25"/>
                     <a:stretch>
                       <a:fillRect/>
                     </a:stretch>
@@ -9304,7 +9390,7 @@
         <w:drawing>
           <wp:inline xmlns:a="http://schemas.openxmlformats.org/drawingml/2006/main" xmlns:pic="http://schemas.openxmlformats.org/drawingml/2006/picture">
             <wp:extent cx="5669280" cy="4033196"/>
-            <wp:docPr id="17" name="Picture 17"/>
+            <wp:docPr id="18" name="Picture 18"/>
             <wp:cNvGraphicFramePr>
               <a:graphicFrameLocks noChangeAspect="1"/>
             </wp:cNvGraphicFramePr>
@@ -9316,7 +9402,7 @@
                     <pic:cNvPicPr/>
                   </pic:nvPicPr>
                   <pic:blipFill>
-                    <a:blip r:embed="rId25"/>
+                    <a:blip r:embed="rId26"/>
                     <a:stretch>
                       <a:fillRect/>
                     </a:stretch>
@@ -9933,7 +10019,7 @@
         <w:drawing>
           <wp:inline xmlns:a="http://schemas.openxmlformats.org/drawingml/2006/main" xmlns:pic="http://schemas.openxmlformats.org/drawingml/2006/picture">
             <wp:extent cx="5669280" cy="4033196"/>
-            <wp:docPr id="18" name="Picture 18"/>
+            <wp:docPr id="19" name="Picture 19"/>
             <wp:cNvGraphicFramePr>
               <a:graphicFrameLocks noChangeAspect="1"/>
             </wp:cNvGraphicFramePr>
@@ -9945,7 +10031,7 @@
                     <pic:cNvPicPr/>
                   </pic:nvPicPr>
                   <pic:blipFill>
-                    <a:blip r:embed="rId26"/>
+                    <a:blip r:embed="rId27"/>
                     <a:stretch>
                       <a:fillRect/>
                     </a:stretch>
@@ -10487,7 +10573,7 @@
         <w:drawing>
           <wp:inline xmlns:a="http://schemas.openxmlformats.org/drawingml/2006/main" xmlns:pic="http://schemas.openxmlformats.org/drawingml/2006/picture">
             <wp:extent cx="5669280" cy="4033196"/>
-            <wp:docPr id="19" name="Picture 19"/>
+            <wp:docPr id="20" name="Picture 20"/>
             <wp:cNvGraphicFramePr>
               <a:graphicFrameLocks noChangeAspect="1"/>
             </wp:cNvGraphicFramePr>
@@ -10499,7 +10585,7 @@
                     <pic:cNvPicPr/>
                   </pic:nvPicPr>
                   <pic:blipFill>
-                    <a:blip r:embed="rId27"/>
+                    <a:blip r:embed="rId28"/>
                     <a:stretch>
                       <a:fillRect/>
                     </a:stretch>
@@ -11466,7 +11552,7 @@
         <w:drawing>
           <wp:inline xmlns:a="http://schemas.openxmlformats.org/drawingml/2006/main" xmlns:pic="http://schemas.openxmlformats.org/drawingml/2006/picture">
             <wp:extent cx="5669280" cy="3764771"/>
-            <wp:docPr id="20" name="Picture 20"/>
+            <wp:docPr id="21" name="Picture 21"/>
             <wp:cNvGraphicFramePr>
               <a:graphicFrameLocks noChangeAspect="1"/>
             </wp:cNvGraphicFramePr>
@@ -11478,7 +11564,7 @@
                     <pic:cNvPicPr/>
                   </pic:nvPicPr>
                   <pic:blipFill>
-                    <a:blip r:embed="rId28"/>
+                    <a:blip r:embed="rId29"/>
                     <a:stretch>
                       <a:fillRect/>
                     </a:stretch>
@@ -11552,7 +11638,7 @@
         <w:drawing>
           <wp:inline xmlns:a="http://schemas.openxmlformats.org/drawingml/2006/main" xmlns:pic="http://schemas.openxmlformats.org/drawingml/2006/picture">
             <wp:extent cx="5669280" cy="3700158"/>
-            <wp:docPr id="21" name="Picture 21"/>
+            <wp:docPr id="22" name="Picture 22"/>
             <wp:cNvGraphicFramePr>
               <a:graphicFrameLocks noChangeAspect="1"/>
             </wp:cNvGraphicFramePr>
@@ -11564,7 +11650,7 @@
                     <pic:cNvPicPr/>
                   </pic:nvPicPr>
                   <pic:blipFill>
-                    <a:blip r:embed="rId29"/>
+                    <a:blip r:embed="rId30"/>
                     <a:stretch>
                       <a:fillRect/>
                     </a:stretch>

</xml_diff>